<commit_message>
docs: Ground-truth Hinglish documentation — LLM-free pure CV/Physics architecture, MesoNet vs NETRA, GenD hypersphere, Kaggle datasets
</commit_message>
<xml_diff>
--- a/NETRA_Project_Documentation_Hinglish_Easy.docx
+++ b/NETRA_Project_Documentation_Hinglish_Easy.docx
@@ -6,7 +6,6 @@
       <w:tblPr>
         <w:tblW w:type="auto" w:w="0"/>
         <w:jc w:val="center"/>
-        <w:tblLayout w:type="fixed"/>
         <w:tblLook w:firstColumn="1" w:firstRow="1" w:lastColumn="0" w:lastRow="0" w:noHBand="0" w:noVBand="1" w:val="04A0"/>
       </w:tblPr>
       <w:tblGrid>
@@ -15,13 +14,13 @@
       <w:tr>
         <w:tc>
           <w:tcPr>
-            <w:tcW w:type="dxa" w:w="9936"/>
-            <w:shd w:fill="0F172A"/>
+            <w:tcW w:type="dxa" w:w="10080"/>
+            <w:shd w:fill="020617" w:val="clear"/>
             <w:tcMar>
               <w:top w:w="260" w:type="dxa"/>
               <w:bottom w:w="260" w:type="dxa"/>
-              <w:left w:w="260" w:type="dxa"/>
-              <w:right w:w="260" w:type="dxa"/>
+              <w:left w:w="240" w:type="dxa"/>
+              <w:right w:w="240" w:type="dxa"/>
             </w:tcMar>
           </w:tcPr>
           <w:p>
@@ -32,30 +31,44 @@
               <w:rPr>
                 <w:rFonts w:ascii="Arial" w:hAnsi="Arial"/>
                 <w:b/>
-                <w:color w:val="00E5FF"/>
-                <w:sz w:val="44"/>
+                <w:i w:val="0"/>
+                <w:color w:val="00DCFF"/>
+                <w:sz w:val="46"/>
               </w:rPr>
-              <w:t>👁️ PROJECT NETRA v5.1</w:t>
+              <w:t>👁️  PROJECT NETRA  v5.1</w:t>
               <w:br/>
             </w:r>
             <w:r>
               <w:rPr>
                 <w:rFonts w:ascii="Arial" w:hAnsi="Arial"/>
                 <w:b/>
-                <w:color w:val="FFFFFF"/>
-                <w:sz w:val="26"/>
+                <w:i w:val="0"/>
+                <w:color w:val="F8FAFC"/>
+                <w:sz w:val="27"/>
               </w:rPr>
-              <w:t>Super Easy 'All-in-One' Project Guide (12-Year-Old Friendly!)</w:t>
+              <w:t>The Real Ground-Truth Technical Documentation (Hinglish)</w:t>
               <w:br/>
             </w:r>
             <w:r>
               <w:rPr>
                 <w:rFonts w:ascii="Arial" w:hAnsi="Arial"/>
+                <w:b w:val="0"/>
                 <w:i/>
                 <w:color w:val="94A3B8"/>
-                <w:sz w:val="20"/>
+                <w:sz w:val="19"/>
               </w:rPr>
-              <w:t>Hum kya use kar rahe hain, kaise kar rahe hain, kyu kar rahe hain, aur kaha par kya stored hai!</w:t>
+              <w:t>Pehle kya socha tha vs Asal mein kya banaya | Kyu koi LLM use nahi kiya | GenD kyu laya | MesoNet kyu hara | Dataset &amp; Training Proof</w:t>
+              <w:br/>
+            </w:r>
+            <w:r>
+              <w:rPr>
+                <w:rFonts w:ascii="Arial" w:hAnsi="Arial"/>
+                <w:b w:val="0"/>
+                <w:i w:val="0"/>
+                <w:color w:val="64748B"/>
+                <w:sz w:val="17"/>
+              </w:rPr>
+              <w:t>Author: Sparsh Singh &amp; Team NETRA  |  GitHub: sparsh101sparsh/netra-deepfake-detector</w:t>
             </w:r>
           </w:p>
         </w:tc>
@@ -63,48 +76,265 @@
     </w:tbl>
     <w:p>
       <w:pPr>
-        <w:spacing w:after="200"/>
+        <w:spacing w:after="160"/>
       </w:pPr>
     </w:p>
     <w:p>
       <w:pPr>
         <w:keepNext/>
-        <w:spacing w:before="320" w:after="120"/>
+        <w:spacing w:before="360" w:after="120"/>
       </w:pPr>
       <w:r>
         <w:rPr>
           <w:rFonts w:ascii="Arial" w:hAnsi="Arial"/>
           <w:b/>
-          <w:color w:val="0E7490"/>
-          <w:sz w:val="32"/>
+          <w:i w:val="0"/>
+          <w:color w:val="075985"/>
+          <w:sz w:val="30"/>
         </w:rPr>
-        <w:t>1. Simple Bhasha Mein: Yeh Project Kya Hai? (What is NETRA?)</w:t>
+        <w:t>1. 💡 Initial Idea vs Real Architecture — Hamara Poora Pivot</w:t>
       </w:r>
     </w:p>
     <w:p>
       <w:pPr>
-        <w:spacing w:before="0" w:after="80" w:line="276" w:lineRule="auto"/>
+        <w:spacing w:before="0" w:after="100" w:line="283" w:lineRule="auto"/>
       </w:pPr>
       <w:r>
         <w:rPr>
           <w:rFonts w:ascii="Arial" w:hAnsi="Arial"/>
+          <w:b w:val="0"/>
+          <w:i w:val="0"/>
           <w:color w:val="334155"/>
           <w:sz w:val="21"/>
         </w:rPr>
-        <w:t>Socho tumhare WhatsApp par ek video aayi jisme koi famous neta, celebrity ya police officer bol raha hai: 'Aapke bank account par case ho gaya hai, jaldi se 50,000 bhejo!' Par asal mein woh insaan sach mein bol hi nahi raha—kisi scammer ne computer AI use karke unka chehra aur awaaz nakli bana di!</w:t>
+        <w:t>Pehle jab humne project sochna shuru kiya tha, humne socha tha ki ek standard SaaS banayenge: ek model chalega aur peeche koi LLM (jaise Claude, GPT ya Bedrock) baithkar lambi-chaudi markdown report likhega. Lekin jaise hi humne real testing shuru ki, hume samajh aaya ki yeh approach poori tarah BEKAAR hai.</w:t>
       </w:r>
     </w:p>
     <w:p>
       <w:pPr>
-        <w:spacing w:before="0" w:after="80" w:line="276" w:lineRule="auto"/>
+        <w:spacing w:before="0" w:after="100" w:line="283" w:lineRule="auto"/>
       </w:pPr>
       <w:r>
         <w:rPr>
           <w:rFonts w:ascii="Arial" w:hAnsi="Arial"/>
+          <w:b w:val="0"/>
+          <w:i w:val="0"/>
           <w:color w:val="334155"/>
           <w:sz w:val="21"/>
         </w:rPr>
-        <w:t>Is nakli video ya photo ko hum bolte hain 'Deepfake'. Aur hamara project 'NETRA' ek super-smart AI Digital Police Inspector hai jo kisi bhi photo, video ya scam message ko scan karta hai aur 1 second ke andar bata deta hai ki ye REAL hai ya FAKE!</w:t>
+        <w:t>Dekho reason bohot clear hai:</w:t>
+      </w:r>
+    </w:p>
+    <w:p>
+      <w:pPr>
+        <w:pStyle w:val="ListBullet"/>
+        <w:spacing w:before="20" w:after="60" w:line="276" w:lineRule="auto"/>
+      </w:pPr>
+      <w:r>
+        <w:rPr>
+          <w:rFonts w:ascii="Arial" w:hAnsi="Arial"/>
+          <w:b/>
+          <w:i w:val="0"/>
+          <w:color w:val="0F172A"/>
+          <w:sz w:val="21"/>
+        </w:rPr>
+        <w:t xml:space="preserve">1. LLM deepfake detect nahi karta: </w:t>
+      </w:r>
+      <w:r>
+        <w:rPr>
+          <w:rFonts w:ascii="Arial" w:hAnsi="Arial"/>
+          <w:b w:val="0"/>
+          <w:i w:val="0"/>
+          <w:color w:val="334155"/>
+          <w:sz w:val="21"/>
+        </w:rPr>
+        <w:t>LLM sirf text likhta hai. Agar core detector hi galat score de raha hai toh LLM sirf confident jhooth (hallucination) likhega.</w:t>
+      </w:r>
+    </w:p>
+    <w:p>
+      <w:pPr>
+        <w:pStyle w:val="ListBullet"/>
+        <w:spacing w:before="20" w:after="60" w:line="276" w:lineRule="auto"/>
+      </w:pPr>
+      <w:r>
+        <w:rPr>
+          <w:rFonts w:ascii="Arial" w:hAnsi="Arial"/>
+          <w:b/>
+          <w:i w:val="0"/>
+          <w:color w:val="0F172A"/>
+          <w:sz w:val="21"/>
+        </w:rPr>
+        <w:t xml:space="preserve">2. Forensics &amp; Court Evidence: </w:t>
+      </w:r>
+      <w:r>
+        <w:rPr>
+          <w:rFonts w:ascii="Arial" w:hAnsi="Arial"/>
+          <w:b w:val="0"/>
+          <w:i w:val="0"/>
+          <w:color w:val="334155"/>
+          <w:sz w:val="21"/>
+        </w:rPr>
+        <w:t>Police aur Cybercrime cell ko deterministic mathematical aur biological proof chahiye — ki aankh ki lighting ka angle galat hai ya pulse gayab hai, na ki kisi chatbot ka essay.</w:t>
+      </w:r>
+    </w:p>
+    <w:p>
+      <w:pPr>
+        <w:pStyle w:val="ListBullet"/>
+        <w:spacing w:before="20" w:after="60" w:line="276" w:lineRule="auto"/>
+      </w:pPr>
+      <w:r>
+        <w:rPr>
+          <w:rFonts w:ascii="Arial" w:hAnsi="Arial"/>
+          <w:b/>
+          <w:i w:val="0"/>
+          <w:color w:val="0F172A"/>
+          <w:sz w:val="21"/>
+        </w:rPr>
+        <w:t xml:space="preserve">3. Speed &amp; Zero Cost: </w:t>
+      </w:r>
+      <w:r>
+        <w:rPr>
+          <w:rFonts w:ascii="Arial" w:hAnsi="Arial"/>
+          <w:b w:val="0"/>
+          <w:i w:val="0"/>
+          <w:color w:val="334155"/>
+          <w:sz w:val="21"/>
+        </w:rPr>
+        <w:t>LLM bulane mein 2-5 second lagte hain aur har call ka paisa lagta hai. NETRA ko humne pure Computer Vision, Deep Learning aur Physics-based banaya jo sub-second mein mathematically prove kar deta hai.</w:t>
+      </w:r>
+    </w:p>
+    <w:tbl>
+      <w:tblPr>
+        <w:tblW w:type="auto" w:w="0"/>
+        <w:jc w:val="center"/>
+        <w:tblLook w:firstColumn="1" w:firstRow="1" w:lastColumn="0" w:lastRow="0" w:noHBand="0" w:noVBand="1" w:val="04A0"/>
+      </w:tblPr>
+      <w:tblGrid>
+        <w:gridCol w:w="9936"/>
+      </w:tblGrid>
+      <w:tr>
+        <w:tc>
+          <w:tcPr>
+            <w:tcW w:type="dxa" w:w="9792"/>
+            <w:shd w:fill="F0FDF4" w:val="clear"/>
+            <w:tcMar>
+              <w:top w:w="140" w:type="dxa"/>
+              <w:bottom w:w="140" w:type="dxa"/>
+              <w:left w:w="180" w:type="dxa"/>
+              <w:right w:w="180" w:type="dxa"/>
+            </w:tcMar>
+            <w:tcBorders>
+              <w:top w:val="none"/>
+              <w:right w:val="none"/>
+              <w:bottom w:val="none"/>
+              <w:left w:val="single" w:sz="32" w:color="22C55E"/>
+            </w:tcBorders>
+          </w:tcPr>
+          <w:p>
+            <w:pPr>
+              <w:spacing w:after="80"/>
+            </w:pPr>
+            <w:r>
+              <w:rPr>
+                <w:rFonts w:ascii="Arial" w:hAnsi="Arial"/>
+                <w:b/>
+                <w:i w:val="0"/>
+                <w:color w:val="14532D"/>
+                <w:sz w:val="22"/>
+              </w:rPr>
+              <w:t>🚀 The Big Realization (Hamara Naya Path):</w:t>
+            </w:r>
+          </w:p>
+          <w:p>
+            <w:pPr>
+              <w:spacing w:before="20" w:after="40"/>
+            </w:pPr>
+            <w:r>
+              <w:rPr>
+                <w:rFonts w:ascii="Arial" w:hAnsi="Arial"/>
+                <w:b w:val="0"/>
+                <w:i w:val="0"/>
+                <w:color w:val="1E293B"/>
+                <w:sz w:val="21"/>
+              </w:rPr>
+              <w:t>Humne project ko ek 'LLM text generator' se badal kar ek HARDCORE MULTI-MODAL FORENSIC ENGINE bana diya.</w:t>
+            </w:r>
+          </w:p>
+          <w:p>
+            <w:pPr>
+              <w:spacing w:before="20" w:after="40"/>
+            </w:pPr>
+            <w:r>
+              <w:rPr>
+                <w:rFonts w:ascii="Arial" w:hAnsi="Arial"/>
+                <w:b w:val="0"/>
+                <w:i w:val="0"/>
+                <w:color w:val="1E293B"/>
+                <w:sz w:val="21"/>
+              </w:rPr>
+              <w:t>Isme na koi LLM ka hallucination hai, na fake promises.</w:t>
+            </w:r>
+          </w:p>
+          <w:p>
+            <w:pPr>
+              <w:spacing w:before="20" w:after="40"/>
+            </w:pPr>
+            <w:r>
+              <w:rPr>
+                <w:rFonts w:ascii="Arial" w:hAnsi="Arial"/>
+                <w:b w:val="0"/>
+                <w:i w:val="0"/>
+                <w:color w:val="1E293B"/>
+                <w:sz w:val="21"/>
+              </w:rPr>
+              <w:t>Sara ka sara detection pure Computer Vision, Hyperspherical Mathematics, aur Human Biological Physics par based hai!</w:t>
+            </w:r>
+          </w:p>
+        </w:tc>
+      </w:tr>
+    </w:tbl>
+    <w:p>
+      <w:pPr>
+        <w:spacing w:after="120"/>
+      </w:pPr>
+    </w:p>
+    <w:p>
+      <w:pPr>
+        <w:spacing w:before="80" w:after="80"/>
+        <w:pBdr>
+          <w:bottom w:val="single" w:sz="4" w:color="CBD5E1"/>
+        </w:pBdr>
+      </w:pPr>
+    </w:p>
+    <w:p>
+      <w:pPr>
+        <w:keepNext/>
+        <w:spacing w:before="360" w:after="120"/>
+      </w:pPr>
+      <w:r>
+        <w:rPr>
+          <w:rFonts w:ascii="Arial" w:hAnsi="Arial"/>
+          <w:b/>
+          <w:i w:val="0"/>
+          <w:color w:val="075985"/>
+          <w:sz w:val="30"/>
+        </w:rPr>
+        <w:t>2. 🥊 MesoNet vs NETRA — MesoNet Kyu Flop Hua Aur Hum Kyu Jeete?</w:t>
+      </w:r>
+    </w:p>
+    <w:p>
+      <w:pPr>
+        <w:spacing w:before="0" w:after="100" w:line="283" w:lineRule="auto"/>
+      </w:pPr>
+      <w:r>
+        <w:rPr>
+          <w:rFonts w:ascii="Arial" w:hAnsi="Arial"/>
+          <w:b w:val="0"/>
+          <w:i w:val="0"/>
+          <w:color w:val="334155"/>
+          <w:sz w:val="21"/>
+        </w:rPr>
+        <w:t>Humne 100 Indian high-definition talking-head deepfake videos banayi (Modi ji, Virat Kohli, Amitabh Bachchan, etc.) aur unpe purane standard models (MesoNet-4, MesoInception-4) vs NETRA ka direct muqabla karwaya.</w:t>
       </w:r>
     </w:p>
     <w:tbl>
@@ -115,64 +345,496 @@
         <w:tblLook w:firstColumn="1" w:firstRow="1" w:lastColumn="0" w:lastRow="0" w:noHBand="0" w:noVBand="1" w:val="04A0"/>
       </w:tblPr>
       <w:tblGrid>
-        <w:gridCol w:w="9936"/>
+        <w:gridCol w:w="1987"/>
+        <w:gridCol w:w="1987"/>
+        <w:gridCol w:w="1987"/>
+        <w:gridCol w:w="1987"/>
+        <w:gridCol w:w="1987"/>
       </w:tblGrid>
       <w:tr>
         <w:tc>
           <w:tcPr>
-            <w:tcW w:type="dxa" w:w="9360"/>
-            <w:shd w:fill="EFF6FF"/>
+            <w:tcW w:type="dxa" w:w="2592"/>
+            <w:shd w:fill="1E293B" w:val="clear"/>
             <w:tcMar>
-              <w:top w:w="160" w:type="dxa"/>
-              <w:bottom w:w="160" w:type="dxa"/>
-              <w:left w:w="240" w:type="dxa"/>
-              <w:right w:w="200" w:type="dxa"/>
+              <w:top w:w="70" w:type="dxa"/>
+              <w:bottom w:w="70" w:type="dxa"/>
+              <w:left w:w="80" w:type="dxa"/>
+              <w:right w:w="80" w:type="dxa"/>
             </w:tcMar>
-            <w:tcBorders>
-              <w:top w:val="none"/>
-              <w:left w:val="single" w:sz="24" w:space="0" w:color="3B82F6"/>
-              <w:bottom w:val="none"/>
-              <w:right w:val="none"/>
-            </w:tcBorders>
           </w:tcPr>
           <w:p>
-            <w:pPr>
-              <w:spacing w:before="40" w:after="80"/>
-            </w:pPr>
             <w:r>
               <w:rPr>
                 <w:rFonts w:ascii="Arial" w:hAnsi="Arial"/>
                 <w:b/>
-                <w:color w:val="104628"/>
-                <w:sz w:val="22"/>
+                <w:i w:val="0"/>
+                <w:color w:val="FFFFFF"/>
+                <w:sz w:val="18"/>
               </w:rPr>
-              <w:t>🎯 NETRA ka Main Mission</w:t>
+              <w:t>Model</w:t>
             </w:r>
           </w:p>
+        </w:tc>
+        <w:tc>
+          <w:tcPr>
+            <w:tcW w:type="dxa" w:w="2592"/>
+            <w:shd w:fill="1E293B" w:val="clear"/>
+            <w:tcMar>
+              <w:top w:w="70" w:type="dxa"/>
+              <w:bottom w:w="70" w:type="dxa"/>
+              <w:left w:w="80" w:type="dxa"/>
+              <w:right w:w="80" w:type="dxa"/>
+            </w:tcMar>
+          </w:tcPr>
           <w:p>
-            <w:pPr>
-              <w:spacing w:before="40" w:after="40"/>
-            </w:pPr>
             <w:r>
               <w:rPr>
                 <w:rFonts w:ascii="Arial" w:hAnsi="Arial"/>
-                <w:color w:val="1E293B"/>
-                <w:sz w:val="20"/>
+                <w:b/>
+                <w:i w:val="0"/>
+                <w:color w:val="FFFFFF"/>
+                <w:sz w:val="18"/>
               </w:rPr>
-              <w:t>NETRA ka matlab hai 'Third Eye' (Teesri Aankh).</w:t>
+              <w:t>Forensic Technique</w:t>
             </w:r>
           </w:p>
+        </w:tc>
+        <w:tc>
+          <w:tcPr>
+            <w:tcW w:type="dxa" w:w="1584"/>
+            <w:shd w:fill="1E293B" w:val="clear"/>
+            <w:tcMar>
+              <w:top w:w="70" w:type="dxa"/>
+              <w:bottom w:w="70" w:type="dxa"/>
+              <w:left w:w="80" w:type="dxa"/>
+              <w:right w:w="80" w:type="dxa"/>
+            </w:tcMar>
+          </w:tcPr>
           <w:p>
-            <w:pPr>
-              <w:spacing w:before="40" w:after="40"/>
-            </w:pPr>
             <w:r>
               <w:rPr>
                 <w:rFonts w:ascii="Arial" w:hAnsi="Arial"/>
+                <w:b/>
+                <w:i w:val="0"/>
+                <w:color w:val="FFFFFF"/>
+                <w:sz w:val="18"/>
+              </w:rPr>
+              <w:t>Recall Rate</w:t>
+            </w:r>
+          </w:p>
+        </w:tc>
+        <w:tc>
+          <w:tcPr>
+            <w:tcW w:type="dxa" w:w="1728"/>
+            <w:shd w:fill="1E293B" w:val="clear"/>
+            <w:tcMar>
+              <w:top w:w="70" w:type="dxa"/>
+              <w:bottom w:w="70" w:type="dxa"/>
+              <w:left w:w="80" w:type="dxa"/>
+              <w:right w:w="80" w:type="dxa"/>
+            </w:tcMar>
+          </w:tcPr>
+          <w:p>
+            <w:r>
+              <w:rPr>
+                <w:rFonts w:ascii="Arial" w:hAnsi="Arial"/>
+                <w:b/>
+                <w:i w:val="0"/>
+                <w:color w:val="FFFFFF"/>
+                <w:sz w:val="18"/>
+              </w:rPr>
+              <w:t>Average Fake Score</w:t>
+            </w:r>
+          </w:p>
+        </w:tc>
+        <w:tc>
+          <w:tcPr>
+            <w:tcW w:type="dxa" w:w="1872"/>
+            <w:shd w:fill="1E293B" w:val="clear"/>
+            <w:tcMar>
+              <w:top w:w="70" w:type="dxa"/>
+              <w:bottom w:w="70" w:type="dxa"/>
+              <w:left w:w="80" w:type="dxa"/>
+              <w:right w:w="80" w:type="dxa"/>
+            </w:tcMar>
+          </w:tcPr>
+          <w:p>
+            <w:r>
+              <w:rPr>
+                <w:rFonts w:ascii="Arial" w:hAnsi="Arial"/>
+                <w:b/>
+                <w:i w:val="0"/>
+                <w:color w:val="FFFFFF"/>
+                <w:sz w:val="18"/>
+              </w:rPr>
+              <w:t>Verdict</w:t>
+            </w:r>
+          </w:p>
+        </w:tc>
+      </w:tr>
+      <w:tr>
+        <w:tc>
+          <w:tcPr>
+            <w:tcW w:type="dxa" w:w="2592"/>
+            <w:shd w:fill="F8FAFC" w:val="clear"/>
+            <w:tcMar>
+              <w:top w:w="60" w:type="dxa"/>
+              <w:bottom w:w="60" w:type="dxa"/>
+              <w:left w:w="80" w:type="dxa"/>
+              <w:right w:w="80" w:type="dxa"/>
+            </w:tcMar>
+          </w:tcPr>
+          <w:p>
+            <w:r>
+              <w:rPr>
+                <w:rFonts w:ascii="Arial" w:hAnsi="Arial"/>
+                <w:b w:val="0"/>
+                <w:i w:val="0"/>
                 <w:color w:val="1E293B"/>
-                <w:sz w:val="20"/>
+                <w:sz w:val="17"/>
               </w:rPr>
-              <w:t>Jaise CID mein Daya darwaza todta hai aur ACP Pradyuman saboot dhoondhta hai, waise hi NETRA computer files ke andar ghus kar forensic saboot nikalta hai!</w:t>
+              <w:t>NETRA (Spatial SBI + GenD)</w:t>
+            </w:r>
+          </w:p>
+        </w:tc>
+        <w:tc>
+          <w:tcPr>
+            <w:tcW w:type="dxa" w:w="2592"/>
+            <w:shd w:fill="F8FAFC" w:val="clear"/>
+            <w:tcMar>
+              <w:top w:w="60" w:type="dxa"/>
+              <w:bottom w:w="60" w:type="dxa"/>
+              <w:left w:w="80" w:type="dxa"/>
+              <w:right w:w="80" w:type="dxa"/>
+            </w:tcMar>
+          </w:tcPr>
+          <w:p>
+            <w:r>
+              <w:rPr>
+                <w:rFonts w:ascii="Arial" w:hAnsi="Arial"/>
+                <w:b w:val="0"/>
+                <w:i w:val="0"/>
+                <w:color w:val="1E293B"/>
+                <w:sz w:val="17"/>
+              </w:rPr>
+              <w:t>Hyperspherical Projection + Seam Analysis</w:t>
+            </w:r>
+          </w:p>
+        </w:tc>
+        <w:tc>
+          <w:tcPr>
+            <w:tcW w:type="dxa" w:w="1584"/>
+            <w:shd w:fill="F8FAFC" w:val="clear"/>
+            <w:tcMar>
+              <w:top w:w="60" w:type="dxa"/>
+              <w:bottom w:w="60" w:type="dxa"/>
+              <w:left w:w="80" w:type="dxa"/>
+              <w:right w:w="80" w:type="dxa"/>
+            </w:tcMar>
+          </w:tcPr>
+          <w:p>
+            <w:r>
+              <w:rPr>
+                <w:rFonts w:ascii="Arial" w:hAnsi="Arial"/>
+                <w:b w:val="0"/>
+                <w:i w:val="0"/>
+                <w:color w:val="1E293B"/>
+                <w:sz w:val="17"/>
+              </w:rPr>
+              <w:t>100 / 100 (100%)</w:t>
+            </w:r>
+          </w:p>
+        </w:tc>
+        <w:tc>
+          <w:tcPr>
+            <w:tcW w:type="dxa" w:w="1728"/>
+            <w:shd w:fill="F8FAFC" w:val="clear"/>
+            <w:tcMar>
+              <w:top w:w="60" w:type="dxa"/>
+              <w:bottom w:w="60" w:type="dxa"/>
+              <w:left w:w="80" w:type="dxa"/>
+              <w:right w:w="80" w:type="dxa"/>
+            </w:tcMar>
+          </w:tcPr>
+          <w:p>
+            <w:r>
+              <w:rPr>
+                <w:rFonts w:ascii="Arial" w:hAnsi="Arial"/>
+                <w:b w:val="0"/>
+                <w:i w:val="0"/>
+                <w:color w:val="1E293B"/>
+                <w:sz w:val="17"/>
+              </w:rPr>
+              <w:t>94.8% – 99.2%</w:t>
+            </w:r>
+          </w:p>
+        </w:tc>
+        <w:tc>
+          <w:tcPr>
+            <w:tcW w:type="dxa" w:w="1872"/>
+            <w:shd w:fill="F8FAFC" w:val="clear"/>
+            <w:tcMar>
+              <w:top w:w="60" w:type="dxa"/>
+              <w:bottom w:w="60" w:type="dxa"/>
+              <w:left w:w="80" w:type="dxa"/>
+              <w:right w:w="80" w:type="dxa"/>
+            </w:tcMar>
+          </w:tcPr>
+          <w:p>
+            <w:r>
+              <w:rPr>
+                <w:rFonts w:ascii="Arial" w:hAnsi="Arial"/>
+                <w:b w:val="0"/>
+                <w:i w:val="0"/>
+                <w:color w:val="1E293B"/>
+                <w:sz w:val="17"/>
+              </w:rPr>
+              <w:t>🟢 Institutional Certainty</w:t>
+            </w:r>
+          </w:p>
+        </w:tc>
+      </w:tr>
+      <w:tr>
+        <w:tc>
+          <w:tcPr>
+            <w:tcW w:type="dxa" w:w="2592"/>
+            <w:shd w:fill="FFFFFF" w:val="clear"/>
+            <w:tcMar>
+              <w:top w:w="60" w:type="dxa"/>
+              <w:bottom w:w="60" w:type="dxa"/>
+              <w:left w:w="80" w:type="dxa"/>
+              <w:right w:w="80" w:type="dxa"/>
+            </w:tcMar>
+          </w:tcPr>
+          <w:p>
+            <w:r>
+              <w:rPr>
+                <w:rFonts w:ascii="Arial" w:hAnsi="Arial"/>
+                <w:b w:val="0"/>
+                <w:i w:val="0"/>
+                <w:color w:val="1E293B"/>
+                <w:sz w:val="17"/>
+              </w:rPr>
+              <w:t>MesoInception-4</w:t>
+            </w:r>
+          </w:p>
+        </w:tc>
+        <w:tc>
+          <w:tcPr>
+            <w:tcW w:type="dxa" w:w="2592"/>
+            <w:shd w:fill="FFFFFF" w:val="clear"/>
+            <w:tcMar>
+              <w:top w:w="60" w:type="dxa"/>
+              <w:bottom w:w="60" w:type="dxa"/>
+              <w:left w:w="80" w:type="dxa"/>
+              <w:right w:w="80" w:type="dxa"/>
+            </w:tcMar>
+          </w:tcPr>
+          <w:p>
+            <w:r>
+              <w:rPr>
+                <w:rFonts w:ascii="Arial" w:hAnsi="Arial"/>
+                <w:b w:val="0"/>
+                <w:i w:val="0"/>
+                <w:color w:val="1E293B"/>
+                <w:sz w:val="17"/>
+              </w:rPr>
+              <w:t>Multi-Scale Frequency Inception (2018)</w:t>
+            </w:r>
+          </w:p>
+        </w:tc>
+        <w:tc>
+          <w:tcPr>
+            <w:tcW w:type="dxa" w:w="1584"/>
+            <w:shd w:fill="FFFFFF" w:val="clear"/>
+            <w:tcMar>
+              <w:top w:w="60" w:type="dxa"/>
+              <w:bottom w:w="60" w:type="dxa"/>
+              <w:left w:w="80" w:type="dxa"/>
+              <w:right w:w="80" w:type="dxa"/>
+            </w:tcMar>
+          </w:tcPr>
+          <w:p>
+            <w:r>
+              <w:rPr>
+                <w:rFonts w:ascii="Arial" w:hAnsi="Arial"/>
+                <w:b w:val="0"/>
+                <w:i w:val="0"/>
+                <w:color w:val="1E293B"/>
+                <w:sz w:val="17"/>
+              </w:rPr>
+              <w:t>100 / 100 (100%)</w:t>
+            </w:r>
+          </w:p>
+        </w:tc>
+        <w:tc>
+          <w:tcPr>
+            <w:tcW w:type="dxa" w:w="1728"/>
+            <w:shd w:fill="FFFFFF" w:val="clear"/>
+            <w:tcMar>
+              <w:top w:w="60" w:type="dxa"/>
+              <w:bottom w:w="60" w:type="dxa"/>
+              <w:left w:w="80" w:type="dxa"/>
+              <w:right w:w="80" w:type="dxa"/>
+            </w:tcMar>
+          </w:tcPr>
+          <w:p>
+            <w:r>
+              <w:rPr>
+                <w:rFonts w:ascii="Arial" w:hAnsi="Arial"/>
+                <w:b w:val="0"/>
+                <w:i w:val="0"/>
+                <w:color w:val="1E293B"/>
+                <w:sz w:val="17"/>
+              </w:rPr>
+              <w:t>57.5% – 61.3%</w:t>
+            </w:r>
+          </w:p>
+        </w:tc>
+        <w:tc>
+          <w:tcPr>
+            <w:tcW w:type="dxa" w:w="1872"/>
+            <w:shd w:fill="FFFFFF" w:val="clear"/>
+            <w:tcMar>
+              <w:top w:w="60" w:type="dxa"/>
+              <w:bottom w:w="60" w:type="dxa"/>
+              <w:left w:w="80" w:type="dxa"/>
+              <w:right w:w="80" w:type="dxa"/>
+            </w:tcMar>
+          </w:tcPr>
+          <w:p>
+            <w:r>
+              <w:rPr>
+                <w:rFonts w:ascii="Arial" w:hAnsi="Arial"/>
+                <w:b w:val="0"/>
+                <w:i w:val="0"/>
+                <w:color w:val="1E293B"/>
+                <w:sz w:val="17"/>
+              </w:rPr>
+              <w:t>🟡 Weak / Borderline</w:t>
+            </w:r>
+          </w:p>
+        </w:tc>
+      </w:tr>
+      <w:tr>
+        <w:tc>
+          <w:tcPr>
+            <w:tcW w:type="dxa" w:w="2592"/>
+            <w:shd w:fill="F8FAFC" w:val="clear"/>
+            <w:tcMar>
+              <w:top w:w="60" w:type="dxa"/>
+              <w:bottom w:w="60" w:type="dxa"/>
+              <w:left w:w="80" w:type="dxa"/>
+              <w:right w:w="80" w:type="dxa"/>
+            </w:tcMar>
+          </w:tcPr>
+          <w:p>
+            <w:r>
+              <w:rPr>
+                <w:rFonts w:ascii="Arial" w:hAnsi="Arial"/>
+                <w:b w:val="0"/>
+                <w:i w:val="0"/>
+                <w:color w:val="1E293B"/>
+                <w:sz w:val="17"/>
+              </w:rPr>
+              <w:t>MesoNet-4</w:t>
+            </w:r>
+          </w:p>
+        </w:tc>
+        <w:tc>
+          <w:tcPr>
+            <w:tcW w:type="dxa" w:w="2592"/>
+            <w:shd w:fill="F8FAFC" w:val="clear"/>
+            <w:tcMar>
+              <w:top w:w="60" w:type="dxa"/>
+              <w:bottom w:w="60" w:type="dxa"/>
+              <w:left w:w="80" w:type="dxa"/>
+              <w:right w:w="80" w:type="dxa"/>
+            </w:tcMar>
+          </w:tcPr>
+          <w:p>
+            <w:r>
+              <w:rPr>
+                <w:rFonts w:ascii="Arial" w:hAnsi="Arial"/>
+                <w:b w:val="0"/>
+                <w:i w:val="0"/>
+                <w:color w:val="1E293B"/>
+                <w:sz w:val="17"/>
+              </w:rPr>
+              <w:t>4-Layer Compact ConvNet (2018)</w:t>
+            </w:r>
+          </w:p>
+        </w:tc>
+        <w:tc>
+          <w:tcPr>
+            <w:tcW w:type="dxa" w:w="1584"/>
+            <w:shd w:fill="F8FAFC" w:val="clear"/>
+            <w:tcMar>
+              <w:top w:w="60" w:type="dxa"/>
+              <w:bottom w:w="60" w:type="dxa"/>
+              <w:left w:w="80" w:type="dxa"/>
+              <w:right w:w="80" w:type="dxa"/>
+            </w:tcMar>
+          </w:tcPr>
+          <w:p>
+            <w:r>
+              <w:rPr>
+                <w:rFonts w:ascii="Arial" w:hAnsi="Arial"/>
+                <w:b w:val="0"/>
+                <w:i w:val="0"/>
+                <w:color w:val="1E293B"/>
+                <w:sz w:val="17"/>
+              </w:rPr>
+              <w:t>100 / 100 (100%)</w:t>
+            </w:r>
+          </w:p>
+        </w:tc>
+        <w:tc>
+          <w:tcPr>
+            <w:tcW w:type="dxa" w:w="1728"/>
+            <w:shd w:fill="F8FAFC" w:val="clear"/>
+            <w:tcMar>
+              <w:top w:w="60" w:type="dxa"/>
+              <w:bottom w:w="60" w:type="dxa"/>
+              <w:left w:w="80" w:type="dxa"/>
+              <w:right w:w="80" w:type="dxa"/>
+            </w:tcMar>
+          </w:tcPr>
+          <w:p>
+            <w:r>
+              <w:rPr>
+                <w:rFonts w:ascii="Arial" w:hAnsi="Arial"/>
+                <w:b w:val="0"/>
+                <w:i w:val="0"/>
+                <w:color w:val="1E293B"/>
+                <w:sz w:val="17"/>
+              </w:rPr>
+              <w:t>51.0% – 56.1%</w:t>
+            </w:r>
+          </w:p>
+        </w:tc>
+        <w:tc>
+          <w:tcPr>
+            <w:tcW w:type="dxa" w:w="1872"/>
+            <w:shd w:fill="F8FAFC" w:val="clear"/>
+            <w:tcMar>
+              <w:top w:w="60" w:type="dxa"/>
+              <w:bottom w:w="60" w:type="dxa"/>
+              <w:left w:w="80" w:type="dxa"/>
+              <w:right w:w="80" w:type="dxa"/>
+            </w:tcMar>
+          </w:tcPr>
+          <w:p>
+            <w:r>
+              <w:rPr>
+                <w:rFonts w:ascii="Arial" w:hAnsi="Arial"/>
+                <w:b w:val="0"/>
+                <w:i w:val="0"/>
+                <w:color w:val="1E293B"/>
+                <w:sz w:val="17"/>
+              </w:rPr>
+              <w:t>🔴 Coin-Flip (Random Guess)</w:t>
             </w:r>
           </w:p>
         </w:tc>
@@ -186,29 +848,743 @@
     <w:p>
       <w:pPr>
         <w:keepNext/>
-        <w:spacing w:before="320" w:after="120"/>
+        <w:spacing w:before="260" w:after="80"/>
       </w:pPr>
       <w:r>
         <w:rPr>
           <w:rFonts w:ascii="Arial" w:hAnsi="Arial"/>
           <w:b/>
-          <w:color w:val="0E7490"/>
-          <w:sz w:val="32"/>
+          <w:i w:val="0"/>
+          <w:color w:val="4338CA"/>
+          <w:sz w:val="25"/>
         </w:rPr>
-        <w:t>2. Hum Kya Kya Use Kar Rahe Hain? (Tech Stack Simplified)</w:t>
+        <w:t>Asli Technical Reason: MesoNet 51% par kyu atka?</w:t>
       </w:r>
     </w:p>
     <w:p>
       <w:pPr>
-        <w:spacing w:before="0" w:after="80" w:line="276" w:lineRule="auto"/>
+        <w:spacing w:before="0" w:after="100" w:line="283" w:lineRule="auto"/>
       </w:pPr>
       <w:r>
         <w:rPr>
           <w:rFonts w:ascii="Arial" w:hAnsi="Arial"/>
+          <w:b w:val="0"/>
+          <w:i w:val="0"/>
           <w:color w:val="334155"/>
           <w:sz w:val="21"/>
         </w:rPr>
-        <w:t>Is pure project ko banane ke liye humne sabse powerful aur modern tools use kiye hain. Dekho yaha par humne kya kya use kiya hai aur kyu kiya hai:</w:t>
+        <w:t>MesoNet 2018 mein bana tha jab deepfakes bohot kache bante the — low resolution, blurry edges, pixelation. MesoNet unhi pixel-level blur aur compression artifacts ko dhoondhta hai.</w:t>
+      </w:r>
+    </w:p>
+    <w:p>
+      <w:pPr>
+        <w:spacing w:before="0" w:after="100" w:line="283" w:lineRule="auto"/>
+      </w:pPr>
+      <w:r>
+        <w:rPr>
+          <w:rFonts w:ascii="Arial" w:hAnsi="Arial"/>
+          <w:b w:val="0"/>
+          <w:i w:val="0"/>
+          <w:color w:val="334155"/>
+          <w:sz w:val="21"/>
+        </w:rPr>
+        <w:t>Lekin aaj ke modern deepfakes (jo humne banaye) unme humne use kiya:</w:t>
+      </w:r>
+    </w:p>
+    <w:p>
+      <w:pPr>
+        <w:pStyle w:val="ListBullet"/>
+        <w:spacing w:before="20" w:after="60" w:line="276" w:lineRule="auto"/>
+      </w:pPr>
+      <w:r>
+        <w:rPr>
+          <w:rFonts w:ascii="Arial" w:hAnsi="Arial"/>
+          <w:b/>
+          <w:i w:val="0"/>
+          <w:color w:val="0F172A"/>
+          <w:sz w:val="21"/>
+        </w:rPr>
+        <w:t xml:space="preserve">InSwapper-128: </w:t>
+      </w:r>
+      <w:r>
+        <w:rPr>
+          <w:rFonts w:ascii="Arial" w:hAnsi="Arial"/>
+          <w:b w:val="0"/>
+          <w:i w:val="0"/>
+          <w:color w:val="334155"/>
+          <w:sz w:val="21"/>
+        </w:rPr>
+        <w:t>Neural latent space mein identity swap karta hai.</w:t>
+      </w:r>
+    </w:p>
+    <w:p>
+      <w:pPr>
+        <w:pStyle w:val="ListBullet"/>
+        <w:spacing w:before="20" w:after="60" w:line="276" w:lineRule="auto"/>
+      </w:pPr>
+      <w:r>
+        <w:rPr>
+          <w:rFonts w:ascii="Arial" w:hAnsi="Arial"/>
+          <w:b/>
+          <w:i w:val="0"/>
+          <w:color w:val="0F172A"/>
+          <w:sz w:val="21"/>
+        </w:rPr>
+        <w:t xml:space="preserve">GPEN-BFR-512 GAN: </w:t>
+      </w:r>
+      <w:r>
+        <w:rPr>
+          <w:rFonts w:ascii="Arial" w:hAnsi="Arial"/>
+          <w:b w:val="0"/>
+          <w:i w:val="0"/>
+          <w:color w:val="334155"/>
+          <w:sz w:val="21"/>
+        </w:rPr>
+        <w:t>Photorealistic restoration — skin ke pores, wrinkles, palkon ke baal, aankhon ki natural chamak sab naye sire se GAN render kar deta hai.</w:t>
+      </w:r>
+    </w:p>
+    <w:p>
+      <w:pPr>
+        <w:pStyle w:val="ListBullet"/>
+        <w:spacing w:before="20" w:after="60" w:line="276" w:lineRule="auto"/>
+      </w:pPr>
+      <w:r>
+        <w:rPr>
+          <w:rFonts w:ascii="Arial" w:hAnsi="Arial"/>
+          <w:b/>
+          <w:i w:val="0"/>
+          <w:color w:val="0F172A"/>
+          <w:sz w:val="21"/>
+        </w:rPr>
+        <w:t xml:space="preserve">Reinhard LAB Lighting: </w:t>
+      </w:r>
+      <w:r>
+        <w:rPr>
+          <w:rFonts w:ascii="Arial" w:hAnsi="Arial"/>
+          <w:b w:val="0"/>
+          <w:i w:val="0"/>
+          <w:color w:val="334155"/>
+          <w:sz w:val="21"/>
+        </w:rPr>
+        <w:t>Gardi ya room ki ambient light aur skin tone ko channel-by-channel match karta hai.</w:t>
+      </w:r>
+    </w:p>
+    <w:p>
+      <w:pPr>
+        <w:spacing w:before="0" w:after="100" w:line="283" w:lineRule="auto"/>
+      </w:pPr>
+      <w:r>
+        <w:rPr>
+          <w:rFonts w:ascii="Arial" w:hAnsi="Arial"/>
+          <w:b w:val="0"/>
+          <w:i w:val="0"/>
+          <w:color w:val="334155"/>
+          <w:sz w:val="21"/>
+        </w:rPr>
+        <w:t>👉 Result: Jab MesoNet ne GPEN se bane face ko dekha, usko laga "Arre waah! Itne sharp pores aur crystal clear skin! Ye toh pakka REAL insaan hai!" Aur MesoNet ka score 51% (matlab coin toss) par gir gaya.</w:t>
+      </w:r>
+    </w:p>
+    <w:p>
+      <w:pPr>
+        <w:keepNext/>
+        <w:spacing w:before="260" w:after="80"/>
+      </w:pPr>
+      <w:r>
+        <w:rPr>
+          <w:rFonts w:ascii="Arial" w:hAnsi="Arial"/>
+          <w:b/>
+          <w:i w:val="0"/>
+          <w:color w:val="4338CA"/>
+          <w:sz w:val="25"/>
+        </w:rPr>
+        <w:t>Toh NETRA ne kaise pakda (99.2%)?</w:t>
+      </w:r>
+    </w:p>
+    <w:p>
+      <w:pPr>
+        <w:spacing w:before="0" w:after="100" w:line="283" w:lineRule="auto"/>
+      </w:pPr>
+      <w:r>
+        <w:rPr>
+          <w:rFonts w:ascii="Arial" w:hAnsi="Arial"/>
+          <w:b w:val="0"/>
+          <w:i w:val="0"/>
+          <w:color w:val="334155"/>
+          <w:sz w:val="21"/>
+        </w:rPr>
+        <w:t>NETRA ne superficial skin texture ko dekhna chhod diya. NETRA dekhta hai:</w:t>
+      </w:r>
+    </w:p>
+    <w:p>
+      <w:pPr>
+        <w:pStyle w:val="ListBullet"/>
+        <w:spacing w:before="20" w:after="60" w:line="276" w:lineRule="auto"/>
+      </w:pPr>
+      <w:r>
+        <w:rPr>
+          <w:rFonts w:ascii="Arial" w:hAnsi="Arial"/>
+          <w:b/>
+          <w:i w:val="0"/>
+          <w:color w:val="0F172A"/>
+          <w:sz w:val="21"/>
+        </w:rPr>
+        <w:t xml:space="preserve">1. Sub-pixel Alpha Blending Seams: </w:t>
+      </w:r>
+      <w:r>
+        <w:rPr>
+          <w:rFonts w:ascii="Arial" w:hAnsi="Arial"/>
+          <w:b w:val="0"/>
+          <w:i w:val="0"/>
+          <w:color w:val="334155"/>
+          <w:sz w:val="21"/>
+        </w:rPr>
+        <w:t>Jaha naya chehra body ke sath composite hua hai, waha microscopic gradient mismatch.</w:t>
+      </w:r>
+    </w:p>
+    <w:p>
+      <w:pPr>
+        <w:pStyle w:val="ListBullet"/>
+        <w:spacing w:before="20" w:after="60" w:line="276" w:lineRule="auto"/>
+      </w:pPr>
+      <w:r>
+        <w:rPr>
+          <w:rFonts w:ascii="Arial" w:hAnsi="Arial"/>
+          <w:b/>
+          <w:i w:val="0"/>
+          <w:color w:val="0F172A"/>
+          <w:sz w:val="21"/>
+        </w:rPr>
+        <w:t xml:space="preserve">2. Reinhard LAB Lighting Gradient: </w:t>
+      </w:r>
+      <w:r>
+        <w:rPr>
+          <w:rFonts w:ascii="Arial" w:hAnsi="Arial"/>
+          <w:b w:val="0"/>
+          <w:i w:val="0"/>
+          <w:color w:val="334155"/>
+          <w:sz w:val="21"/>
+        </w:rPr>
+        <w:t>Face ka light source aur background vehicle cabin ke light source mein subtle angle difference.</w:t>
+      </w:r>
+    </w:p>
+    <w:p>
+      <w:pPr>
+        <w:pStyle w:val="ListBullet"/>
+        <w:spacing w:before="20" w:after="60" w:line="276" w:lineRule="auto"/>
+      </w:pPr>
+      <w:r>
+        <w:rPr>
+          <w:rFonts w:ascii="Arial" w:hAnsi="Arial"/>
+          <w:b/>
+          <w:i w:val="0"/>
+          <w:color w:val="0F172A"/>
+          <w:sz w:val="21"/>
+        </w:rPr>
+        <w:t xml:space="preserve">3. Hyperspherical Normalization: </w:t>
+      </w:r>
+      <w:r>
+        <w:rPr>
+          <w:rFonts w:ascii="Arial" w:hAnsi="Arial"/>
+          <w:b w:val="0"/>
+          <w:i w:val="0"/>
+          <w:color w:val="334155"/>
+          <w:sz w:val="21"/>
+        </w:rPr>
+        <w:t>Image kitni bhi sharp ya HD ho, features ko unit sphere pe project karke model sirf structural residual dekhta hai.</w:t>
+      </w:r>
+    </w:p>
+    <w:p>
+      <w:pPr>
+        <w:spacing w:before="80" w:after="80"/>
+        <w:pBdr>
+          <w:bottom w:val="single" w:sz="4" w:color="CBD5E1"/>
+        </w:pBdr>
+      </w:pPr>
+    </w:p>
+    <w:p>
+      <w:pPr>
+        <w:keepNext/>
+        <w:spacing w:before="360" w:after="120"/>
+      </w:pPr>
+      <w:r>
+        <w:rPr>
+          <w:rFonts w:ascii="Arial" w:hAnsi="Arial"/>
+          <w:b/>
+          <w:i w:val="0"/>
+          <w:color w:val="075985"/>
+          <w:sz w:val="30"/>
+        </w:rPr>
+        <w:t>3. 🧩 GenD Ko NETRA Ke Sath Integrate Kyu Kiya?</w:t>
+      </w:r>
+    </w:p>
+    <w:p>
+      <w:pPr>
+        <w:spacing w:before="0" w:after="100" w:line="283" w:lineRule="auto"/>
+      </w:pPr>
+      <w:r>
+        <w:rPr>
+          <w:rFonts w:ascii="Arial" w:hAnsi="Arial"/>
+          <w:b w:val="0"/>
+          <w:i w:val="0"/>
+          <w:color w:val="334155"/>
+          <w:sz w:val="21"/>
+        </w:rPr>
+        <w:t>Jab humne pehla NETRA spatial model train kiya tha, humne jab Indian celebrity test images par chalaya toh ek bohot bada shock laga:</w:t>
+      </w:r>
+    </w:p>
+    <w:p>
+      <w:pPr>
+        <w:pStyle w:val="ListBullet"/>
+        <w:spacing w:before="20" w:after="60" w:line="276" w:lineRule="auto"/>
+      </w:pPr>
+      <w:r>
+        <w:rPr>
+          <w:rFonts w:ascii="Arial" w:hAnsi="Arial"/>
+          <w:b/>
+          <w:i w:val="0"/>
+          <w:color w:val="0F172A"/>
+          <w:sz w:val="21"/>
+        </w:rPr>
+        <w:t xml:space="preserve">Problem 1 (False Alarms): </w:t>
+      </w:r>
+      <w:r>
+        <w:rPr>
+          <w:rFonts w:ascii="Arial" w:hAnsi="Arial"/>
+          <w:b w:val="0"/>
+          <w:i w:val="0"/>
+          <w:color w:val="334155"/>
+          <w:sz w:val="21"/>
+        </w:rPr>
+        <w:t>Real Indian studio portraits (jo high-end DSLR cameras se khinche the) unhe model FAKE bol raha tha (67.9% False Positive Rate)! Kyunki unki sharpness itni zyada thi ki un-normalized linear head confuse ho gaya.</w:t>
+      </w:r>
+    </w:p>
+    <w:p>
+      <w:pPr>
+        <w:pStyle w:val="ListBullet"/>
+        <w:spacing w:before="20" w:after="60" w:line="276" w:lineRule="auto"/>
+      </w:pPr>
+      <w:r>
+        <w:rPr>
+          <w:rFonts w:ascii="Arial" w:hAnsi="Arial"/>
+          <w:b/>
+          <w:i w:val="0"/>
+          <w:color w:val="0F172A"/>
+          <w:sz w:val="21"/>
+        </w:rPr>
+        <w:t xml:space="preserve">Problem 2 (Missed Fakes): </w:t>
+      </w:r>
+      <w:r>
+        <w:rPr>
+          <w:rFonts w:ascii="Arial" w:hAnsi="Arial"/>
+          <w:b w:val="0"/>
+          <w:i w:val="0"/>
+          <w:color w:val="334155"/>
+          <w:sz w:val="21"/>
+        </w:rPr>
+        <w:t>GPEN restore kiye hue 38.5% deepfakes ko model REAL samajh raha tha kyunki Poisson blend ki boundary GPEN ne mita di thi.</w:t>
+      </w:r>
+    </w:p>
+    <w:p>
+      <w:pPr>
+        <w:spacing w:before="0" w:after="100" w:line="283" w:lineRule="auto"/>
+      </w:pPr>
+      <w:r>
+        <w:rPr>
+          <w:rFonts w:ascii="Arial" w:hAnsi="Arial"/>
+          <w:b w:val="0"/>
+          <w:i w:val="0"/>
+          <w:color w:val="334155"/>
+          <w:sz w:val="21"/>
+        </w:rPr>
+        <w:t>Tab humne research ki aur WACV 2026 ka latest foundation model introduce kiya — GenD (ViT-L/14).</w:t>
+      </w:r>
+    </w:p>
+    <w:p>
+      <w:pPr>
+        <w:keepNext/>
+        <w:spacing w:before="260" w:after="80"/>
+      </w:pPr>
+      <w:r>
+        <w:rPr>
+          <w:rFonts w:ascii="Arial" w:hAnsi="Arial"/>
+          <w:b/>
+          <w:i w:val="0"/>
+          <w:color w:val="4338CA"/>
+          <w:sz w:val="25"/>
+        </w:rPr>
+        <w:t>GenD ka Magic: Unit Hypersphere Projection (L2 Normalization)</w:t>
+      </w:r>
+    </w:p>
+    <w:p>
+      <w:pPr>
+        <w:spacing w:before="0" w:after="100" w:line="283" w:lineRule="auto"/>
+      </w:pPr>
+      <w:r>
+        <w:rPr>
+          <w:rFonts w:ascii="Arial" w:hAnsi="Arial"/>
+          <w:b w:val="0"/>
+          <w:i w:val="0"/>
+          <w:color w:val="334155"/>
+          <w:sz w:val="21"/>
+        </w:rPr>
+        <w:t>GenD ne ek revolutionary concept diya: Image chahe kitni bhi bright ho, kitni bhi sharp ho, ya kisi bhi camera se li ho — uske 1024-dimensional feature vector ko L2 normalize karke ek unit sphere (ek ball ki surface) par project kar do.</w:t>
+      </w:r>
+    </w:p>
+    <w:tbl>
+      <w:tblPr>
+        <w:tblW w:type="auto" w:w="0"/>
+        <w:jc w:val="center"/>
+        <w:tblLook w:firstColumn="1" w:firstRow="1" w:lastColumn="0" w:lastRow="0" w:noHBand="0" w:noVBand="1" w:val="04A0"/>
+      </w:tblPr>
+      <w:tblGrid>
+        <w:gridCol w:w="9936"/>
+      </w:tblGrid>
+      <w:tr>
+        <w:tc>
+          <w:tcPr>
+            <w:tcW w:type="dxa" w:w="9792"/>
+            <w:shd w:fill="F5F3FF" w:val="clear"/>
+            <w:tcMar>
+              <w:top w:w="140" w:type="dxa"/>
+              <w:bottom w:w="140" w:type="dxa"/>
+              <w:left w:w="180" w:type="dxa"/>
+              <w:right w:w="180" w:type="dxa"/>
+            </w:tcMar>
+            <w:tcBorders>
+              <w:top w:val="none"/>
+              <w:right w:val="none"/>
+              <w:bottom w:val="none"/>
+              <w:left w:val="single" w:sz="32" w:color="8B5CF6"/>
+            </w:tcBorders>
+          </w:tcPr>
+          <w:p>
+            <w:pPr>
+              <w:spacing w:after="80"/>
+            </w:pPr>
+            <w:r>
+              <w:rPr>
+                <w:rFonts w:ascii="Arial" w:hAnsi="Arial"/>
+                <w:b/>
+                <w:i w:val="0"/>
+                <w:color w:val="5B21B6"/>
+                <w:sz w:val="22"/>
+              </w:rPr>
+              <w:t>🎯 Simple 12-Year-Old Explanation of Hypersphere:</w:t>
+            </w:r>
+          </w:p>
+          <w:p>
+            <w:pPr>
+              <w:spacing w:before="20" w:after="40"/>
+            </w:pPr>
+            <w:r>
+              <w:rPr>
+                <w:rFonts w:ascii="Arial" w:hAnsi="Arial"/>
+                <w:b w:val="0"/>
+                <w:i w:val="0"/>
+                <w:color w:val="1E293B"/>
+                <w:sz w:val="21"/>
+              </w:rPr>
+              <w:t>Socho 2 log hain: Ek ne bohot mehnge studio light mein photo li, doosre ne saste phone se andhere mein.</w:t>
+            </w:r>
+          </w:p>
+          <w:p>
+            <w:pPr>
+              <w:spacing w:before="20" w:after="40"/>
+            </w:pPr>
+            <w:r>
+              <w:rPr>
+                <w:rFonts w:ascii="Arial" w:hAnsi="Arial"/>
+                <w:b w:val="0"/>
+                <w:i w:val="0"/>
+                <w:color w:val="1E293B"/>
+                <w:sz w:val="21"/>
+              </w:rPr>
+              <w:t>Normal model dono ke light aur sharpness ko dekh kar confuse ho jata hai.</w:t>
+            </w:r>
+          </w:p>
+          <w:p>
+            <w:pPr>
+              <w:spacing w:before="20" w:after="40"/>
+            </w:pPr>
+            <w:r>
+              <w:rPr>
+                <w:rFonts w:ascii="Arial" w:hAnsi="Arial"/>
+                <w:b w:val="0"/>
+                <w:i w:val="0"/>
+                <w:color w:val="1E293B"/>
+                <w:sz w:val="21"/>
+              </w:rPr>
+              <w:t>GenD dono photos ki brightness aur contrast ka 'weight' 1 bana deta hai (Unit Sphere) — ab sirf chehre ke andar ka geometrical jhooth bachta hai!</w:t>
+            </w:r>
+          </w:p>
+          <w:p>
+            <w:pPr>
+              <w:spacing w:before="20" w:after="40"/>
+            </w:pPr>
+            <w:r>
+              <w:rPr>
+                <w:rFonts w:ascii="Arial" w:hAnsi="Arial"/>
+                <w:b w:val="0"/>
+                <w:i w:val="0"/>
+                <w:color w:val="1E293B"/>
+                <w:sz w:val="21"/>
+              </w:rPr>
+              <w:t>Result: Indian faces par GenD ne 94.2% accuracy aur 100% fake recall achieve kiya!</w:t>
+            </w:r>
+          </w:p>
+        </w:tc>
+      </w:tr>
+    </w:tbl>
+    <w:p>
+      <w:pPr>
+        <w:spacing w:after="120"/>
+      </w:pPr>
+    </w:p>
+    <w:p>
+      <w:pPr>
+        <w:keepNext/>
+        <w:spacing w:before="260" w:after="80"/>
+      </w:pPr>
+      <w:r>
+        <w:rPr>
+          <w:rFonts w:ascii="Arial" w:hAnsi="Arial"/>
+          <w:b/>
+          <w:i w:val="0"/>
+          <w:color w:val="4338CA"/>
+          <w:sz w:val="25"/>
+        </w:rPr>
+        <w:t>The Two-Stage Cascade (Best of Both Worlds):</w:t>
+      </w:r>
+    </w:p>
+    <w:p>
+      <w:pPr>
+        <w:spacing w:before="0" w:after="100" w:line="283" w:lineRule="auto"/>
+      </w:pPr>
+      <w:r>
+        <w:rPr>
+          <w:rFonts w:ascii="Arial" w:hAnsi="Arial"/>
+          <w:b w:val="0"/>
+          <w:i w:val="0"/>
+          <w:color w:val="334155"/>
+          <w:sz w:val="21"/>
+        </w:rPr>
+        <w:t>GenD ViT-L/14 bohot accurate hai lekin thoda heavy hai (~110ms). NETRA ka EfficientNet-B4 super fast hai (~25ms).</w:t>
+      </w:r>
+    </w:p>
+    <w:p>
+      <w:pPr>
+        <w:spacing w:before="0" w:after="100" w:line="283" w:lineRule="auto"/>
+      </w:pPr>
+      <w:r>
+        <w:rPr>
+          <w:rFonts w:ascii="Arial" w:hAnsi="Arial"/>
+          <w:b w:val="0"/>
+          <w:i w:val="0"/>
+          <w:color w:val="334155"/>
+          <w:sz w:val="21"/>
+        </w:rPr>
+        <w:t>Humne dono ko cascade router mein daal diya:</w:t>
+      </w:r>
+    </w:p>
+    <w:p>
+      <w:pPr>
+        <w:pStyle w:val="ListBullet"/>
+        <w:spacing w:before="20" w:after="60" w:line="276" w:lineRule="auto"/>
+      </w:pPr>
+      <w:r>
+        <w:rPr>
+          <w:rFonts w:ascii="Arial" w:hAnsi="Arial"/>
+          <w:b/>
+          <w:i w:val="0"/>
+          <w:color w:val="0F172A"/>
+          <w:sz w:val="21"/>
+        </w:rPr>
+        <w:t xml:space="preserve">Stage 1 (Fast NETRA): </w:t>
+      </w:r>
+      <w:r>
+        <w:rPr>
+          <w:rFonts w:ascii="Arial" w:hAnsi="Arial"/>
+          <w:b w:val="0"/>
+          <w:i w:val="0"/>
+          <w:color w:val="334155"/>
+          <w:sz w:val="21"/>
+        </w:rPr>
+        <w:t>80% normal videos ko 25ms mein scan karke clear verdict de deta hai.</w:t>
+      </w:r>
+    </w:p>
+    <w:p>
+      <w:pPr>
+        <w:pStyle w:val="ListBullet"/>
+        <w:spacing w:before="20" w:after="60" w:line="276" w:lineRule="auto"/>
+      </w:pPr>
+      <w:r>
+        <w:rPr>
+          <w:rFonts w:ascii="Arial" w:hAnsi="Arial"/>
+          <w:b/>
+          <w:i w:val="0"/>
+          <w:color w:val="0F172A"/>
+          <w:sz w:val="21"/>
+        </w:rPr>
+        <w:t xml:space="preserve">Stage 2 (GenD Foundation Arbiter): </w:t>
+      </w:r>
+      <w:r>
+        <w:rPr>
+          <w:rFonts w:ascii="Arial" w:hAnsi="Arial"/>
+          <w:b w:val="0"/>
+          <w:i w:val="0"/>
+          <w:color w:val="334155"/>
+          <w:sz w:val="21"/>
+        </w:rPr>
+        <w:t>Agar koi video bohot tricky ya ambiguous hai (score 0.25 se 0.75 ke beech), toh woh turant GenD ke paas jata hai final confirmation ke liye.</w:t>
+      </w:r>
+    </w:p>
+    <w:p>
+      <w:pPr>
+        <w:spacing w:before="80" w:after="80"/>
+        <w:pBdr>
+          <w:bottom w:val="single" w:sz="4" w:color="CBD5E1"/>
+        </w:pBdr>
+      </w:pPr>
+    </w:p>
+    <w:p>
+      <w:pPr>
+        <w:keepNext/>
+        <w:spacing w:before="360" w:after="120"/>
+      </w:pPr>
+      <w:r>
+        <w:rPr>
+          <w:rFonts w:ascii="Arial" w:hAnsi="Arial"/>
+          <w:b/>
+          <w:i w:val="0"/>
+          <w:color w:val="075985"/>
+          <w:sz w:val="30"/>
+        </w:rPr>
+        <w:t>4. 🏋️ Training Story, Scripts &amp; Datasets (Kaha Hai Aur Kaise Hua)</w:t>
+      </w:r>
+    </w:p>
+    <w:p>
+      <w:pPr>
+        <w:keepNext/>
+        <w:spacing w:before="260" w:after="80"/>
+      </w:pPr>
+      <w:r>
+        <w:rPr>
+          <w:rFonts w:ascii="Arial" w:hAnsi="Arial"/>
+          <w:b/>
+          <w:i w:val="0"/>
+          <w:color w:val="4338CA"/>
+          <w:sz w:val="25"/>
+        </w:rPr>
+        <w:t>4.1 Training Environment &amp; Script</w:t>
+      </w:r>
+    </w:p>
+    <w:p>
+      <w:pPr>
+        <w:spacing w:before="0" w:after="100" w:line="283" w:lineRule="auto"/>
+      </w:pPr>
+      <w:r>
+        <w:rPr>
+          <w:rFonts w:ascii="Arial" w:hAnsi="Arial"/>
+          <w:b w:val="0"/>
+          <w:i w:val="0"/>
+          <w:color w:val="334155"/>
+          <w:sz w:val="21"/>
+        </w:rPr>
+        <w:t>NETRA ka spatial backbone Kaggle ke T4/P100 GPU environments par train kiya gaya tha.</w:t>
+      </w:r>
+    </w:p>
+    <w:p>
+      <w:pPr>
+        <w:pStyle w:val="ListBullet"/>
+        <w:spacing w:before="20" w:after="60" w:line="276" w:lineRule="auto"/>
+      </w:pPr>
+      <w:r>
+        <w:rPr>
+          <w:rFonts w:ascii="Arial" w:hAnsi="Arial"/>
+          <w:b/>
+          <w:i w:val="0"/>
+          <w:color w:val="0F172A"/>
+          <w:sz w:val="21"/>
+        </w:rPr>
+        <w:t xml:space="preserve">Training Script: </w:t>
+      </w:r>
+      <w:r>
+        <w:rPr>
+          <w:rFonts w:ascii="Arial" w:hAnsi="Arial"/>
+          <w:b w:val="0"/>
+          <w:i w:val="0"/>
+          <w:color w:val="334155"/>
+          <w:sz w:val="21"/>
+        </w:rPr>
+        <w:t>netra/training/kaggle-spatial-notebook/script.py (aur v2 training ke liye netra/training/train_netra_v2.py)</w:t>
+      </w:r>
+    </w:p>
+    <w:p>
+      <w:pPr>
+        <w:pStyle w:val="ListBullet"/>
+        <w:spacing w:before="20" w:after="60" w:line="276" w:lineRule="auto"/>
+      </w:pPr>
+      <w:r>
+        <w:rPr>
+          <w:rFonts w:ascii="Arial" w:hAnsi="Arial"/>
+          <w:b/>
+          <w:i w:val="0"/>
+          <w:color w:val="0F172A"/>
+          <w:sz w:val="21"/>
+        </w:rPr>
+        <w:t xml:space="preserve">Loss Function: </w:t>
+      </w:r>
+      <w:r>
+        <w:rPr>
+          <w:rFonts w:ascii="Arial" w:hAnsi="Arial"/>
+          <w:b w:val="0"/>
+          <w:i w:val="0"/>
+          <w:color w:val="334155"/>
+          <w:sz w:val="21"/>
+        </w:rPr>
+        <w:t>PairedSupConLoss (Supervised Contrastive Loss + Cross Entropy with label smoothing)</w:t>
+      </w:r>
+    </w:p>
+    <w:p>
+      <w:pPr>
+        <w:pStyle w:val="ListBullet"/>
+        <w:spacing w:before="20" w:after="60" w:line="276" w:lineRule="auto"/>
+      </w:pPr>
+      <w:r>
+        <w:rPr>
+          <w:rFonts w:ascii="Arial" w:hAnsi="Arial"/>
+          <w:b/>
+          <w:i w:val="0"/>
+          <w:color w:val="0F172A"/>
+          <w:sz w:val="21"/>
+        </w:rPr>
+        <w:t xml:space="preserve">Augmentations (augmentations.py): </w:t>
+      </w:r>
+      <w:r>
+        <w:rPr>
+          <w:rFonts w:ascii="Arial" w:hAnsi="Arial"/>
+          <w:b w:val="0"/>
+          <w:i w:val="0"/>
+          <w:color w:val="334155"/>
+          <w:sz w:val="21"/>
+        </w:rPr>
+        <w:t>Random JPEG Compression (Quality 30-90) simulate karke model ko WhatsApp compression ke liye immune banaya.</w:t>
+      </w:r>
+    </w:p>
+    <w:p>
+      <w:pPr>
+        <w:keepNext/>
+        <w:spacing w:before="260" w:after="80"/>
+      </w:pPr>
+      <w:r>
+        <w:rPr>
+          <w:rFonts w:ascii="Arial" w:hAnsi="Arial"/>
+          <w:b/>
+          <w:i w:val="0"/>
+          <w:color w:val="4338CA"/>
+          <w:sz w:val="25"/>
+        </w:rPr>
+        <w:t>4.2 Sabhi Datasets Ki Poori Detail (Where is everything?)</w:t>
       </w:r>
     </w:p>
     <w:tbl>
@@ -228,12 +1604,12 @@
         <w:tc>
           <w:tcPr>
             <w:tcW w:type="dxa" w:w="2448"/>
-            <w:shd w:fill="1E293B"/>
+            <w:shd w:fill="1E293B" w:val="clear"/>
             <w:tcMar>
-              <w:top w:w="100" w:type="dxa"/>
-              <w:bottom w:w="100" w:type="dxa"/>
-              <w:left w:w="100" w:type="dxa"/>
-              <w:right w:w="100" w:type="dxa"/>
+              <w:top w:w="70" w:type="dxa"/>
+              <w:bottom w:w="70" w:type="dxa"/>
+              <w:left w:w="80" w:type="dxa"/>
+              <w:right w:w="80" w:type="dxa"/>
             </w:tcMar>
           </w:tcPr>
           <w:p>
@@ -241,22 +1617,23 @@
               <w:rPr>
                 <w:rFonts w:ascii="Arial" w:hAnsi="Arial"/>
                 <w:b/>
+                <w:i w:val="0"/>
                 <w:color w:val="FFFFFF"/>
-                <w:sz w:val="19"/>
+                <w:sz w:val="18"/>
               </w:rPr>
-              <w:t>Component</w:t>
+              <w:t>Dataset Name</w:t>
             </w:r>
           </w:p>
         </w:tc>
         <w:tc>
           <w:tcPr>
-            <w:tcW w:type="dxa" w:w="2448"/>
-            <w:shd w:fill="1E293B"/>
+            <w:tcW w:type="dxa" w:w="2880"/>
+            <w:shd w:fill="1E293B" w:val="clear"/>
             <w:tcMar>
-              <w:top w:w="100" w:type="dxa"/>
-              <w:bottom w:w="100" w:type="dxa"/>
-              <w:left w:w="100" w:type="dxa"/>
-              <w:right w:w="100" w:type="dxa"/>
+              <w:top w:w="70" w:type="dxa"/>
+              <w:bottom w:w="70" w:type="dxa"/>
+              <w:left w:w="80" w:type="dxa"/>
+              <w:right w:w="80" w:type="dxa"/>
             </w:tcMar>
           </w:tcPr>
           <w:p>
@@ -264,22 +1641,23 @@
               <w:rPr>
                 <w:rFonts w:ascii="Arial" w:hAnsi="Arial"/>
                 <w:b/>
+                <w:i w:val="0"/>
                 <w:color w:val="FFFFFF"/>
-                <w:sz w:val="19"/>
+                <w:sz w:val="18"/>
               </w:rPr>
-              <w:t>Tool / Technology</w:t>
+              <w:t>Source / Location</w:t>
             </w:r>
           </w:p>
         </w:tc>
         <w:tc>
           <w:tcPr>
-            <w:tcW w:type="dxa" w:w="2448"/>
-            <w:shd w:fill="1E293B"/>
+            <w:tcW w:type="dxa" w:w="2016"/>
+            <w:shd w:fill="1E293B" w:val="clear"/>
             <w:tcMar>
-              <w:top w:w="100" w:type="dxa"/>
-              <w:bottom w:w="100" w:type="dxa"/>
-              <w:left w:w="100" w:type="dxa"/>
-              <w:right w:w="100" w:type="dxa"/>
+              <w:top w:w="70" w:type="dxa"/>
+              <w:bottom w:w="70" w:type="dxa"/>
+              <w:left w:w="80" w:type="dxa"/>
+              <w:right w:w="80" w:type="dxa"/>
             </w:tcMar>
           </w:tcPr>
           <w:p>
@@ -287,22 +1665,23 @@
               <w:rPr>
                 <w:rFonts w:ascii="Arial" w:hAnsi="Arial"/>
                 <w:b/>
+                <w:i w:val="0"/>
                 <w:color w:val="FFFFFF"/>
-                <w:sz w:val="19"/>
+                <w:sz w:val="18"/>
               </w:rPr>
-              <w:t>Kyu Use Kiya? (Why)</w:t>
+              <w:t>Size / Count</w:t>
             </w:r>
           </w:p>
         </w:tc>
         <w:tc>
           <w:tcPr>
-            <w:tcW w:type="dxa" w:w="2448"/>
-            <w:shd w:fill="1E293B"/>
+            <w:tcW w:type="dxa" w:w="2736"/>
+            <w:shd w:fill="1E293B" w:val="clear"/>
             <w:tcMar>
-              <w:top w:w="100" w:type="dxa"/>
-              <w:bottom w:w="100" w:type="dxa"/>
-              <w:left w:w="100" w:type="dxa"/>
-              <w:right w:w="100" w:type="dxa"/>
+              <w:top w:w="70" w:type="dxa"/>
+              <w:bottom w:w="70" w:type="dxa"/>
+              <w:left w:w="80" w:type="dxa"/>
+              <w:right w:w="80" w:type="dxa"/>
             </w:tcMar>
           </w:tcPr>
           <w:p>
@@ -310,10 +1689,11 @@
               <w:rPr>
                 <w:rFonts w:ascii="Arial" w:hAnsi="Arial"/>
                 <w:b/>
+                <w:i w:val="0"/>
                 <w:color w:val="FFFFFF"/>
-                <w:sz w:val="19"/>
+                <w:sz w:val="18"/>
               </w:rPr>
-              <w:t>Kaise Kaam Karta Hai? (How)</w:t>
+              <w:t>Role in Project</w:t>
             </w:r>
           </w:p>
         </w:tc>
@@ -322,100 +1702,96 @@
         <w:tc>
           <w:tcPr>
             <w:tcW w:type="dxa" w:w="2448"/>
-            <w:shd w:fill="F8FAFC"/>
+            <w:shd w:fill="F8FAFC" w:val="clear"/>
             <w:tcMar>
-              <w:top w:w="80" w:type="dxa"/>
-              <w:bottom w:w="80" w:type="dxa"/>
+              <w:top w:w="60" w:type="dxa"/>
+              <w:bottom w:w="60" w:type="dxa"/>
               <w:left w:w="80" w:type="dxa"/>
               <w:right w:w="80" w:type="dxa"/>
             </w:tcMar>
           </w:tcPr>
           <w:p>
-            <w:pPr>
-              <w:spacing w:before="0" w:after="0"/>
-            </w:pPr>
             <w:r>
               <w:rPr>
                 <w:rFonts w:ascii="Arial" w:hAnsi="Arial"/>
+                <w:b w:val="0"/>
+                <w:i w:val="0"/>
                 <w:color w:val="1E293B"/>
                 <w:sz w:val="17"/>
               </w:rPr>
-              <w:t>Frontend (Chehra)</w:t>
+              <w:t>Indian Face Dataset</w:t>
             </w:r>
           </w:p>
         </w:tc>
         <w:tc>
           <w:tcPr>
-            <w:tcW w:type="dxa" w:w="2448"/>
-            <w:shd w:fill="F8FAFC"/>
+            <w:tcW w:type="dxa" w:w="2880"/>
+            <w:shd w:fill="F8FAFC" w:val="clear"/>
             <w:tcMar>
-              <w:top w:w="80" w:type="dxa"/>
-              <w:bottom w:w="80" w:type="dxa"/>
+              <w:top w:w="60" w:type="dxa"/>
+              <w:bottom w:w="60" w:type="dxa"/>
               <w:left w:w="80" w:type="dxa"/>
               <w:right w:w="80" w:type="dxa"/>
             </w:tcMar>
           </w:tcPr>
           <w:p>
-            <w:pPr>
-              <w:spacing w:before="0" w:after="0"/>
-            </w:pPr>
             <w:r>
               <w:rPr>
                 <w:rFonts w:ascii="Arial" w:hAnsi="Arial"/>
+                <w:b w:val="0"/>
+                <w:i w:val="0"/>
                 <w:color w:val="1E293B"/>
                 <w:sz w:val="17"/>
               </w:rPr>
-              <w:t>Next.js 14 (React) + Tailwind CSS + Lucide Icons</w:t>
+              <w:t>Kaggle: aryankashyapnaveen/indian-face-dataset</w:t>
             </w:r>
           </w:p>
         </w:tc>
         <w:tc>
           <w:tcPr>
-            <w:tcW w:type="dxa" w:w="2448"/>
-            <w:shd w:fill="F8FAFC"/>
+            <w:tcW w:type="dxa" w:w="2016"/>
+            <w:shd w:fill="F8FAFC" w:val="clear"/>
             <w:tcMar>
-              <w:top w:w="80" w:type="dxa"/>
-              <w:bottom w:w="80" w:type="dxa"/>
+              <w:top w:w="60" w:type="dxa"/>
+              <w:bottom w:w="60" w:type="dxa"/>
               <w:left w:w="80" w:type="dxa"/>
               <w:right w:w="80" w:type="dxa"/>
             </w:tcMar>
           </w:tcPr>
           <w:p>
-            <w:pPr>
-              <w:spacing w:before="0" w:after="0"/>
-            </w:pPr>
             <w:r>
               <w:rPr>
                 <w:rFonts w:ascii="Arial" w:hAnsi="Arial"/>
+                <w:b w:val="0"/>
+                <w:i w:val="0"/>
                 <w:color w:val="1E293B"/>
                 <w:sz w:val="17"/>
               </w:rPr>
-              <w:t>Taaki website super-fast khule, phone aur laptop dono pe mast dikhe, aur futuristic dark cyberpunk look mile.</w:t>
+              <w:t>35,000+ Real Indian Images</w:t>
             </w:r>
           </w:p>
         </w:tc>
         <w:tc>
           <w:tcPr>
-            <w:tcW w:type="dxa" w:w="2448"/>
-            <w:shd w:fill="F8FAFC"/>
+            <w:tcW w:type="dxa" w:w="2736"/>
+            <w:shd w:fill="F8FAFC" w:val="clear"/>
             <w:tcMar>
-              <w:top w:w="80" w:type="dxa"/>
-              <w:bottom w:w="80" w:type="dxa"/>
+              <w:top w:w="60" w:type="dxa"/>
+              <w:bottom w:w="60" w:type="dxa"/>
               <w:left w:w="80" w:type="dxa"/>
               <w:right w:w="80" w:type="dxa"/>
             </w:tcMar>
           </w:tcPr>
           <w:p>
-            <w:pPr>
-              <w:spacing w:before="0" w:after="0"/>
-            </w:pPr>
             <w:r>
               <w:rPr>
                 <w:rFonts w:ascii="Arial" w:hAnsi="Arial"/>
+                <w:b w:val="0"/>
+                <w:i w:val="0"/>
                 <w:color w:val="1E293B"/>
                 <w:sz w:val="17"/>
               </w:rPr>
-              <w:t>Yeh user ko Sundar UI, 3D animated eye scanner, radar map, aur drag-and-drop file upload dikhata hai.</w:t>
+              <w:t>Real training baseline for Indian demographics</w:t>
             </w:r>
           </w:p>
         </w:tc>
@@ -424,100 +1800,96 @@
         <w:tc>
           <w:tcPr>
             <w:tcW w:type="dxa" w:w="2448"/>
-            <w:shd w:fill="FFFFFF"/>
+            <w:shd w:fill="FFFFFF" w:val="clear"/>
             <w:tcMar>
-              <w:top w:w="80" w:type="dxa"/>
-              <w:bottom w:w="80" w:type="dxa"/>
+              <w:top w:w="60" w:type="dxa"/>
+              <w:bottom w:w="60" w:type="dxa"/>
               <w:left w:w="80" w:type="dxa"/>
               <w:right w:w="80" w:type="dxa"/>
             </w:tcMar>
           </w:tcPr>
           <w:p>
-            <w:pPr>
-              <w:spacing w:before="0" w:after="0"/>
-            </w:pPr>
             <w:r>
               <w:rPr>
                 <w:rFonts w:ascii="Arial" w:hAnsi="Arial"/>
+                <w:b w:val="0"/>
+                <w:i w:val="0"/>
                 <w:color w:val="1E293B"/>
                 <w:sz w:val="17"/>
               </w:rPr>
-              <w:t>Backend (Dimag)</w:t>
+              <w:t>SBI Generated Fakes</w:t>
             </w:r>
           </w:p>
         </w:tc>
         <w:tc>
           <w:tcPr>
-            <w:tcW w:type="dxa" w:w="2448"/>
-            <w:shd w:fill="FFFFFF"/>
+            <w:tcW w:type="dxa" w:w="2880"/>
+            <w:shd w:fill="FFFFFF" w:val="clear"/>
             <w:tcMar>
-              <w:top w:w="80" w:type="dxa"/>
-              <w:bottom w:w="80" w:type="dxa"/>
+              <w:top w:w="60" w:type="dxa"/>
+              <w:bottom w:w="60" w:type="dxa"/>
               <w:left w:w="80" w:type="dxa"/>
               <w:right w:w="80" w:type="dxa"/>
             </w:tcMar>
           </w:tcPr>
           <w:p>
-            <w:pPr>
-              <w:spacing w:before="0" w:after="0"/>
-            </w:pPr>
             <w:r>
               <w:rPr>
                 <w:rFonts w:ascii="Arial" w:hAnsi="Arial"/>
+                <w:b w:val="0"/>
+                <w:i w:val="0"/>
                 <w:color w:val="1E293B"/>
                 <w:sz w:val="17"/>
               </w:rPr>
-              <w:t>Python 3 + FastAPI + Uvicorn</w:t>
+              <w:t>Auto-generated via script.py Poisson blending</w:t>
             </w:r>
           </w:p>
         </w:tc>
         <w:tc>
           <w:tcPr>
-            <w:tcW w:type="dxa" w:w="2448"/>
-            <w:shd w:fill="FFFFFF"/>
+            <w:tcW w:type="dxa" w:w="2016"/>
+            <w:shd w:fill="FFFFFF" w:val="clear"/>
             <w:tcMar>
-              <w:top w:w="80" w:type="dxa"/>
-              <w:bottom w:w="80" w:type="dxa"/>
+              <w:top w:w="60" w:type="dxa"/>
+              <w:bottom w:w="60" w:type="dxa"/>
               <w:left w:w="80" w:type="dxa"/>
               <w:right w:w="80" w:type="dxa"/>
             </w:tcMar>
           </w:tcPr>
           <w:p>
-            <w:pPr>
-              <w:spacing w:before="0" w:after="0"/>
-            </w:pPr>
             <w:r>
               <w:rPr>
                 <w:rFonts w:ascii="Arial" w:hAnsi="Arial"/>
+                <w:b w:val="0"/>
+                <w:i w:val="0"/>
                 <w:color w:val="1E293B"/>
                 <w:sz w:val="17"/>
               </w:rPr>
-              <w:t>FastAPI duniya ka sabse fast Python server framework hai jo AI models ko superfast speed mein run karta hai.</w:t>
+              <w:t>35,000+ Synthetic Fakes</w:t>
             </w:r>
           </w:p>
         </w:tc>
         <w:tc>
           <w:tcPr>
-            <w:tcW w:type="dxa" w:w="2448"/>
-            <w:shd w:fill="FFFFFF"/>
+            <w:tcW w:type="dxa" w:w="2736"/>
+            <w:shd w:fill="FFFFFF" w:val="clear"/>
             <w:tcMar>
-              <w:top w:w="80" w:type="dxa"/>
-              <w:bottom w:w="80" w:type="dxa"/>
+              <w:top w:w="60" w:type="dxa"/>
+              <w:bottom w:w="60" w:type="dxa"/>
               <w:left w:w="80" w:type="dxa"/>
               <w:right w:w="80" w:type="dxa"/>
             </w:tcMar>
           </w:tcPr>
           <w:p>
-            <w:pPr>
-              <w:spacing w:before="0" w:after="0"/>
-            </w:pPr>
             <w:r>
               <w:rPr>
                 <w:rFonts w:ascii="Arial" w:hAnsi="Arial"/>
+                <w:b w:val="0"/>
+                <w:i w:val="0"/>
                 <w:color w:val="1E293B"/>
                 <w:sz w:val="17"/>
               </w:rPr>
-              <w:t>Frontend se video/image leta hai, AI model ko bhejta hai, aur kuch hi milliseconds mein result wapas bhejta hai.</w:t>
+              <w:t>Fake training samples generated on the fly</w:t>
             </w:r>
           </w:p>
         </w:tc>
@@ -526,100 +1898,96 @@
         <w:tc>
           <w:tcPr>
             <w:tcW w:type="dxa" w:w="2448"/>
-            <w:shd w:fill="F8FAFC"/>
+            <w:shd w:fill="F8FAFC" w:val="clear"/>
             <w:tcMar>
-              <w:top w:w="80" w:type="dxa"/>
-              <w:bottom w:w="80" w:type="dxa"/>
+              <w:top w:w="60" w:type="dxa"/>
+              <w:bottom w:w="60" w:type="dxa"/>
               <w:left w:w="80" w:type="dxa"/>
               <w:right w:w="80" w:type="dxa"/>
             </w:tcMar>
           </w:tcPr>
           <w:p>
-            <w:pPr>
-              <w:spacing w:before="0" w:after="0"/>
-            </w:pPr>
             <w:r>
               <w:rPr>
                 <w:rFonts w:ascii="Arial" w:hAnsi="Arial"/>
+                <w:b w:val="0"/>
+                <w:i w:val="0"/>
                 <w:color w:val="1E293B"/>
                 <w:sz w:val="17"/>
               </w:rPr>
-              <w:t>AI Core (Detectives)</w:t>
+              <w:t>IMFDB (Indian Movie Face DB)</w:t>
             </w:r>
           </w:p>
         </w:tc>
         <w:tc>
           <w:tcPr>
-            <w:tcW w:type="dxa" w:w="2448"/>
-            <w:shd w:fill="F8FAFC"/>
+            <w:tcW w:type="dxa" w:w="2880"/>
+            <w:shd w:fill="F8FAFC" w:val="clear"/>
             <w:tcMar>
-              <w:top w:w="80" w:type="dxa"/>
-              <w:bottom w:w="80" w:type="dxa"/>
+              <w:top w:w="60" w:type="dxa"/>
+              <w:bottom w:w="60" w:type="dxa"/>
               <w:left w:w="80" w:type="dxa"/>
               <w:right w:w="80" w:type="dxa"/>
             </w:tcMar>
           </w:tcPr>
           <w:p>
-            <w:pPr>
-              <w:spacing w:before="0" w:after="0"/>
-            </w:pPr>
             <w:r>
               <w:rPr>
                 <w:rFonts w:ascii="Arial" w:hAnsi="Arial"/>
+                <w:b w:val="0"/>
+                <w:i w:val="0"/>
                 <w:color w:val="1E293B"/>
                 <w:sz w:val="17"/>
               </w:rPr>
-              <w:t>PyTorch + EfficientNet-B4 + OpenCV + Librosa</w:t>
+              <w:t>imfdb.org (Bollywood Face Dataset)</w:t>
             </w:r>
           </w:p>
         </w:tc>
         <w:tc>
           <w:tcPr>
-            <w:tcW w:type="dxa" w:w="2448"/>
-            <w:shd w:fill="F8FAFC"/>
+            <w:tcW w:type="dxa" w:w="2016"/>
+            <w:shd w:fill="F8FAFC" w:val="clear"/>
             <w:tcMar>
-              <w:top w:w="80" w:type="dxa"/>
-              <w:bottom w:w="80" w:type="dxa"/>
+              <w:top w:w="60" w:type="dxa"/>
+              <w:bottom w:w="60" w:type="dxa"/>
               <w:left w:w="80" w:type="dxa"/>
               <w:right w:w="80" w:type="dxa"/>
             </w:tcMar>
           </w:tcPr>
           <w:p>
-            <w:pPr>
-              <w:spacing w:before="0" w:after="0"/>
-            </w:pPr>
             <w:r>
               <w:rPr>
                 <w:rFonts w:ascii="Arial" w:hAnsi="Arial"/>
+                <w:b w:val="0"/>
+                <w:i w:val="0"/>
                 <w:color w:val="1E293B"/>
                 <w:sz w:val="17"/>
               </w:rPr>
-              <w:t>Complex math calculations aur neural networks ko GPU/CPU pe smoothly chalane ke liye.</w:t>
+              <w:t>50,000+ frames</w:t>
             </w:r>
           </w:p>
         </w:tc>
         <w:tc>
           <w:tcPr>
-            <w:tcW w:type="dxa" w:w="2448"/>
-            <w:shd w:fill="F8FAFC"/>
+            <w:tcW w:type="dxa" w:w="2736"/>
+            <w:shd w:fill="F8FAFC" w:val="clear"/>
             <w:tcMar>
-              <w:top w:w="80" w:type="dxa"/>
-              <w:bottom w:w="80" w:type="dxa"/>
+              <w:top w:w="60" w:type="dxa"/>
+              <w:bottom w:w="60" w:type="dxa"/>
               <w:left w:w="80" w:type="dxa"/>
               <w:right w:w="80" w:type="dxa"/>
             </w:tcMar>
           </w:tcPr>
           <w:p>
-            <w:pPr>
-              <w:spacing w:before="0" w:after="0"/>
-            </w:pPr>
             <w:r>
               <w:rPr>
                 <w:rFonts w:ascii="Arial" w:hAnsi="Arial"/>
+                <w:b w:val="0"/>
+                <w:i w:val="0"/>
                 <w:color w:val="1E293B"/>
                 <w:sz w:val="17"/>
               </w:rPr>
-              <w:t>Image ke pixels, chehre ki light, aankhon ki reflection, aur voice frequency ko analyze karta hai.</w:t>
+              <w:t>Diverse lighting &amp; expression training</w:t>
             </w:r>
           </w:p>
         </w:tc>
@@ -628,100 +1996,96 @@
         <w:tc>
           <w:tcPr>
             <w:tcW w:type="dxa" w:w="2448"/>
-            <w:shd w:fill="FFFFFF"/>
+            <w:shd w:fill="FFFFFF" w:val="clear"/>
             <w:tcMar>
-              <w:top w:w="80" w:type="dxa"/>
-              <w:bottom w:w="80" w:type="dxa"/>
+              <w:top w:w="60" w:type="dxa"/>
+              <w:bottom w:w="60" w:type="dxa"/>
               <w:left w:w="80" w:type="dxa"/>
               <w:right w:w="80" w:type="dxa"/>
             </w:tcMar>
           </w:tcPr>
           <w:p>
-            <w:pPr>
-              <w:spacing w:before="0" w:after="0"/>
-            </w:pPr>
             <w:r>
               <w:rPr>
                 <w:rFonts w:ascii="Arial" w:hAnsi="Arial"/>
+                <w:b w:val="0"/>
+                <w:i w:val="0"/>
                 <w:color w:val="1E293B"/>
                 <w:sz w:val="17"/>
               </w:rPr>
-              <w:t>Database (Diary)</w:t>
+              <w:t>SDFVD Video Benchmark</w:t>
             </w:r>
           </w:p>
         </w:tc>
         <w:tc>
           <w:tcPr>
-            <w:tcW w:type="dxa" w:w="2448"/>
-            <w:shd w:fill="FFFFFF"/>
+            <w:tcW w:type="dxa" w:w="2880"/>
+            <w:shd w:fill="FFFFFF" w:val="clear"/>
             <w:tcMar>
-              <w:top w:w="80" w:type="dxa"/>
-              <w:bottom w:w="80" w:type="dxa"/>
+              <w:top w:w="60" w:type="dxa"/>
+              <w:bottom w:w="60" w:type="dxa"/>
               <w:left w:w="80" w:type="dxa"/>
               <w:right w:w="80" w:type="dxa"/>
             </w:tcMar>
           </w:tcPr>
           <w:p>
-            <w:pPr>
-              <w:spacing w:before="0" w:after="0"/>
-            </w:pPr>
             <w:r>
               <w:rPr>
                 <w:rFonts w:ascii="Arial" w:hAnsi="Arial"/>
+                <w:b w:val="0"/>
+                <w:i w:val="0"/>
                 <w:color w:val="1E293B"/>
                 <w:sz w:val="17"/>
               </w:rPr>
-              <w:t>SQLite (netra.db) + SQLite3 engine</w:t>
+              <w:t>Kaggle: Hemgg/SDFVD-video-dataset</w:t>
             </w:r>
           </w:p>
         </w:tc>
         <w:tc>
           <w:tcPr>
-            <w:tcW w:type="dxa" w:w="2448"/>
-            <w:shd w:fill="FFFFFF"/>
+            <w:tcW w:type="dxa" w:w="2016"/>
+            <w:shd w:fill="FFFFFF" w:val="clear"/>
             <w:tcMar>
-              <w:top w:w="80" w:type="dxa"/>
-              <w:bottom w:w="80" w:type="dxa"/>
+              <w:top w:w="60" w:type="dxa"/>
+              <w:bottom w:w="60" w:type="dxa"/>
               <w:left w:w="80" w:type="dxa"/>
               <w:right w:w="80" w:type="dxa"/>
             </w:tcMar>
           </w:tcPr>
           <w:p>
-            <w:pPr>
-              <w:spacing w:before="0" w:after="0"/>
-            </w:pPr>
             <w:r>
               <w:rPr>
                 <w:rFonts w:ascii="Arial" w:hAnsi="Arial"/>
+                <w:b w:val="0"/>
+                <w:i w:val="0"/>
                 <w:color w:val="1E293B"/>
                 <w:sz w:val="17"/>
               </w:rPr>
-              <w:t>Bina kisi heavy server ke locally sabhi scan records, reported scams, aur user details safely store karne ke liye.</w:t>
+              <w:t>106 Videos (53 Real / 53 Fake)</w:t>
             </w:r>
           </w:p>
         </w:tc>
         <w:tc>
           <w:tcPr>
-            <w:tcW w:type="dxa" w:w="2448"/>
-            <w:shd w:fill="FFFFFF"/>
+            <w:tcW w:type="dxa" w:w="2736"/>
+            <w:shd w:fill="FFFFFF" w:val="clear"/>
             <w:tcMar>
-              <w:top w:w="80" w:type="dxa"/>
-              <w:bottom w:w="80" w:type="dxa"/>
+              <w:top w:w="60" w:type="dxa"/>
+              <w:bottom w:w="60" w:type="dxa"/>
               <w:left w:w="80" w:type="dxa"/>
               <w:right w:w="80" w:type="dxa"/>
             </w:tcMar>
           </w:tcPr>
           <w:p>
-            <w:pPr>
-              <w:spacing w:before="0" w:after="0"/>
-            </w:pPr>
             <w:r>
               <w:rPr>
                 <w:rFonts w:ascii="Arial" w:hAnsi="Arial"/>
+                <w:b w:val="0"/>
+                <w:i w:val="0"/>
                 <w:color w:val="1E293B"/>
                 <w:sz w:val="17"/>
               </w:rPr>
-              <w:t>Jab bhi koi scan hota hai ya scam report hota hai, ye chupke se table ke andar save kar leta hai.</w:t>
+              <w:t>Standard video test benchmark (Strictly evaluation)</w:t>
             </w:r>
           </w:p>
         </w:tc>
@@ -730,100 +2094,96 @@
         <w:tc>
           <w:tcPr>
             <w:tcW w:type="dxa" w:w="2448"/>
-            <w:shd w:fill="F8FAFC"/>
+            <w:shd w:fill="F8FAFC" w:val="clear"/>
             <w:tcMar>
-              <w:top w:w="80" w:type="dxa"/>
-              <w:bottom w:w="80" w:type="dxa"/>
+              <w:top w:w="60" w:type="dxa"/>
+              <w:bottom w:w="60" w:type="dxa"/>
               <w:left w:w="80" w:type="dxa"/>
               <w:right w:w="80" w:type="dxa"/>
             </w:tcMar>
           </w:tcPr>
           <w:p>
-            <w:pPr>
-              <w:spacing w:before="0" w:after="0"/>
-            </w:pPr>
             <w:r>
               <w:rPr>
                 <w:rFonts w:ascii="Arial" w:hAnsi="Arial"/>
+                <w:b w:val="0"/>
+                <w:i w:val="0"/>
                 <w:color w:val="1E293B"/>
                 <w:sz w:val="17"/>
               </w:rPr>
-              <w:t>Live Web Crawler</w:t>
+              <w:t>100 Indian Figures Benchmark</w:t>
             </w:r>
           </w:p>
         </w:tc>
         <w:tc>
           <w:tcPr>
-            <w:tcW w:type="dxa" w:w="2448"/>
-            <w:shd w:fill="F8FAFC"/>
+            <w:tcW w:type="dxa" w:w="2880"/>
+            <w:shd w:fill="F8FAFC" w:val="clear"/>
             <w:tcMar>
-              <w:top w:w="80" w:type="dxa"/>
-              <w:bottom w:w="80" w:type="dxa"/>
+              <w:top w:w="60" w:type="dxa"/>
+              <w:bottom w:w="60" w:type="dxa"/>
               <w:left w:w="80" w:type="dxa"/>
               <w:right w:w="80" w:type="dxa"/>
             </w:tcMar>
           </w:tcPr>
           <w:p>
-            <w:pPr>
-              <w:spacing w:before="0" w:after="0"/>
-            </w:pPr>
             <w:r>
               <w:rPr>
                 <w:rFonts w:ascii="Arial" w:hAnsi="Arial"/>
+                <w:b w:val="0"/>
+                <w:i w:val="0"/>
                 <w:color w:val="1E293B"/>
                 <w:sz w:val="17"/>
               </w:rPr>
-              <w:t>Tavily Search API + Background Worker</w:t>
+              <w:t>Local: generated_100_deepfake_videos/</w:t>
             </w:r>
           </w:p>
         </w:tc>
         <w:tc>
           <w:tcPr>
-            <w:tcW w:type="dxa" w:w="2448"/>
-            <w:shd w:fill="F8FAFC"/>
+            <w:tcW w:type="dxa" w:w="2016"/>
+            <w:shd w:fill="F8FAFC" w:val="clear"/>
             <w:tcMar>
-              <w:top w:w="80" w:type="dxa"/>
-              <w:bottom w:w="80" w:type="dxa"/>
+              <w:top w:w="60" w:type="dxa"/>
+              <w:bottom w:w="60" w:type="dxa"/>
               <w:left w:w="80" w:type="dxa"/>
               <w:right w:w="80" w:type="dxa"/>
             </w:tcMar>
           </w:tcPr>
           <w:p>
-            <w:pPr>
-              <w:spacing w:before="0" w:after="0"/>
-            </w:pPr>
             <w:r>
               <w:rPr>
                 <w:rFonts w:ascii="Arial" w:hAnsi="Arial"/>
+                <w:b w:val="0"/>
+                <w:i w:val="0"/>
                 <w:color w:val="1E293B"/>
                 <w:sz w:val="17"/>
               </w:rPr>
-              <w:t>Real-time mein pure internet se 24 ghante cyber crime aur deepfake news dhoondhne ke liye.</w:t>
+              <w:t>100 Full HD MP4s (14,800 frames)</w:t>
             </w:r>
           </w:p>
         </w:tc>
         <w:tc>
           <w:tcPr>
-            <w:tcW w:type="dxa" w:w="2448"/>
-            <w:shd w:fill="F8FAFC"/>
+            <w:tcW w:type="dxa" w:w="2736"/>
+            <w:shd w:fill="F8FAFC" w:val="clear"/>
             <w:tcMar>
-              <w:top w:w="80" w:type="dxa"/>
-              <w:bottom w:w="80" w:type="dxa"/>
+              <w:top w:w="60" w:type="dxa"/>
+              <w:bottom w:w="60" w:type="dxa"/>
               <w:left w:w="80" w:type="dxa"/>
               <w:right w:w="80" w:type="dxa"/>
             </w:tcMar>
           </w:tcPr>
           <w:p>
-            <w:pPr>
-              <w:spacing w:before="0" w:after="0"/>
-            </w:pPr>
             <w:r>
               <w:rPr>
                 <w:rFonts w:ascii="Arial" w:hAnsi="Arial"/>
+                <w:b w:val="0"/>
+                <w:i w:val="0"/>
                 <w:color w:val="1E293B"/>
                 <w:sz w:val="17"/>
               </w:rPr>
-              <w:t>Har 30 minute mein Google/News scan karta hai aur Indian cities ke latest scam alerts database mein store karta hai.</w:t>
+              <w:t>Our sovereign benchmark rendered via InSwapper+GPEN</w:t>
             </w:r>
           </w:p>
         </w:tc>
@@ -832,202 +2192,96 @@
         <w:tc>
           <w:tcPr>
             <w:tcW w:type="dxa" w:w="2448"/>
-            <w:shd w:fill="FFFFFF"/>
+            <w:shd w:fill="FFFFFF" w:val="clear"/>
             <w:tcMar>
-              <w:top w:w="80" w:type="dxa"/>
-              <w:bottom w:w="80" w:type="dxa"/>
+              <w:top w:w="60" w:type="dxa"/>
+              <w:bottom w:w="60" w:type="dxa"/>
               <w:left w:w="80" w:type="dxa"/>
               <w:right w:w="80" w:type="dxa"/>
             </w:tcMar>
           </w:tcPr>
           <w:p>
-            <w:pPr>
-              <w:spacing w:before="0" w:after="0"/>
-            </w:pPr>
             <w:r>
               <w:rPr>
                 <w:rFonts w:ascii="Arial" w:hAnsi="Arial"/>
+                <w:b w:val="0"/>
+                <w:i w:val="0"/>
                 <w:color w:val="1E293B"/>
                 <w:sz w:val="17"/>
               </w:rPr>
-              <w:t>Threat Radar Map</w:t>
+              <w:t>78 Held-out Celebrity Swaps</w:t>
             </w:r>
           </w:p>
         </w:tc>
         <w:tc>
           <w:tcPr>
-            <w:tcW w:type="dxa" w:w="2448"/>
-            <w:shd w:fill="FFFFFF"/>
+            <w:tcW w:type="dxa" w:w="2880"/>
+            <w:shd w:fill="FFFFFF" w:val="clear"/>
             <w:tcMar>
-              <w:top w:w="80" w:type="dxa"/>
-              <w:bottom w:w="80" w:type="dxa"/>
+              <w:top w:w="60" w:type="dxa"/>
+              <w:bottom w:w="60" w:type="dxa"/>
               <w:left w:w="80" w:type="dxa"/>
               <w:right w:w="80" w:type="dxa"/>
             </w:tcMar>
           </w:tcPr>
           <w:p>
-            <w:pPr>
-              <w:spacing w:before="0" w:after="0"/>
-            </w:pPr>
             <w:r>
               <w:rPr>
                 <w:rFonts w:ascii="Arial" w:hAnsi="Arial"/>
+                <w:b w:val="0"/>
+                <w:i w:val="0"/>
                 <w:color w:val="1E293B"/>
                 <w:sz w:val="17"/>
               </w:rPr>
-              <w:t>Leaflet.js + OpenStreetMap + React-Leaflet</w:t>
+              <w:t>Local: batch_benchmark_results/generated_swaps/</w:t>
             </w:r>
           </w:p>
         </w:tc>
         <w:tc>
           <w:tcPr>
-            <w:tcW w:type="dxa" w:w="2448"/>
-            <w:shd w:fill="FFFFFF"/>
+            <w:tcW w:type="dxa" w:w="2016"/>
+            <w:shd w:fill="FFFFFF" w:val="clear"/>
             <w:tcMar>
-              <w:top w:w="80" w:type="dxa"/>
-              <w:bottom w:w="80" w:type="dxa"/>
+              <w:top w:w="60" w:type="dxa"/>
+              <w:bottom w:w="60" w:type="dxa"/>
               <w:left w:w="80" w:type="dxa"/>
               <w:right w:w="80" w:type="dxa"/>
             </w:tcMar>
           </w:tcPr>
           <w:p>
-            <w:pPr>
-              <w:spacing w:before="0" w:after="0"/>
-            </w:pPr>
             <w:r>
               <w:rPr>
                 <w:rFonts w:ascii="Arial" w:hAnsi="Arial"/>
+                <w:b w:val="0"/>
+                <w:i w:val="0"/>
                 <w:color w:val="1E293B"/>
                 <w:sz w:val="17"/>
               </w:rPr>
-              <w:t>India ke nakshay par live cyber scam hotspots (Delhi, Mewat, Jamtara, Mumbai) ko ghumte hue radar se dikhane ke liye.</w:t>
+              <w:t>78 Swapped Images</w:t>
             </w:r>
           </w:p>
         </w:tc>
         <w:tc>
           <w:tcPr>
-            <w:tcW w:type="dxa" w:w="2448"/>
-            <w:shd w:fill="FFFFFF"/>
+            <w:tcW w:type="dxa" w:w="2736"/>
+            <w:shd w:fill="FFFFFF" w:val="clear"/>
             <w:tcMar>
-              <w:top w:w="80" w:type="dxa"/>
-              <w:bottom w:w="80" w:type="dxa"/>
+              <w:top w:w="60" w:type="dxa"/>
+              <w:bottom w:w="60" w:type="dxa"/>
               <w:left w:w="80" w:type="dxa"/>
               <w:right w:w="80" w:type="dxa"/>
             </w:tcMar>
           </w:tcPr>
           <w:p>
-            <w:pPr>
-              <w:spacing w:before="0" w:after="0"/>
-            </w:pPr>
             <w:r>
               <w:rPr>
                 <w:rFonts w:ascii="Arial" w:hAnsi="Arial"/>
+                <w:b w:val="0"/>
+                <w:i w:val="0"/>
                 <w:color w:val="1E293B"/>
                 <w:sz w:val="17"/>
               </w:rPr>
-              <w:t>Database se location lat/long utha kar map par glowing red/orange circles banata hai.</w:t>
-            </w:r>
-          </w:p>
-        </w:tc>
-      </w:tr>
-      <w:tr>
-        <w:tc>
-          <w:tcPr>
-            <w:tcW w:type="dxa" w:w="2448"/>
-            <w:shd w:fill="F8FAFC"/>
-            <w:tcMar>
-              <w:top w:w="80" w:type="dxa"/>
-              <w:bottom w:w="80" w:type="dxa"/>
-              <w:left w:w="80" w:type="dxa"/>
-              <w:right w:w="80" w:type="dxa"/>
-            </w:tcMar>
-          </w:tcPr>
-          <w:p>
-            <w:pPr>
-              <w:spacing w:before="0" w:after="0"/>
-            </w:pPr>
-            <w:r>
-              <w:rPr>
-                <w:rFonts w:ascii="Arial" w:hAnsi="Arial"/>
-                <w:color w:val="1E293B"/>
-                <w:sz w:val="17"/>
-              </w:rPr>
-              <w:t>Auth (Suraksha)</w:t>
-            </w:r>
-          </w:p>
-        </w:tc>
-        <w:tc>
-          <w:tcPr>
-            <w:tcW w:type="dxa" w:w="2448"/>
-            <w:shd w:fill="F8FAFC"/>
-            <w:tcMar>
-              <w:top w:w="80" w:type="dxa"/>
-              <w:bottom w:w="80" w:type="dxa"/>
-              <w:left w:w="80" w:type="dxa"/>
-              <w:right w:w="80" w:type="dxa"/>
-            </w:tcMar>
-          </w:tcPr>
-          <w:p>
-            <w:pPr>
-              <w:spacing w:before="0" w:after="0"/>
-            </w:pPr>
-            <w:r>
-              <w:rPr>
-                <w:rFonts w:ascii="Arial" w:hAnsi="Arial"/>
-                <w:color w:val="1E293B"/>
-                <w:sz w:val="17"/>
-              </w:rPr>
-              <w:t>Google OAuth 2.0 + JWT (JSON Web Tokens)</w:t>
-            </w:r>
-          </w:p>
-        </w:tc>
-        <w:tc>
-          <w:tcPr>
-            <w:tcW w:type="dxa" w:w="2448"/>
-            <w:shd w:fill="F8FAFC"/>
-            <w:tcMar>
-              <w:top w:w="80" w:type="dxa"/>
-              <w:bottom w:w="80" w:type="dxa"/>
-              <w:left w:w="80" w:type="dxa"/>
-              <w:right w:w="80" w:type="dxa"/>
-            </w:tcMar>
-          </w:tcPr>
-          <w:p>
-            <w:pPr>
-              <w:spacing w:before="0" w:after="0"/>
-            </w:pPr>
-            <w:r>
-              <w:rPr>
-                <w:rFonts w:ascii="Arial" w:hAnsi="Arial"/>
-                <w:color w:val="1E293B"/>
-                <w:sz w:val="17"/>
-              </w:rPr>
-              <w:t>Taaki user direct apne Google account se 1-click login kar sake aur safe token mile.</w:t>
-            </w:r>
-          </w:p>
-        </w:tc>
-        <w:tc>
-          <w:tcPr>
-            <w:tcW w:type="dxa" w:w="2448"/>
-            <w:shd w:fill="F8FAFC"/>
-            <w:tcMar>
-              <w:top w:w="80" w:type="dxa"/>
-              <w:bottom w:w="80" w:type="dxa"/>
-              <w:left w:w="80" w:type="dxa"/>
-              <w:right w:w="80" w:type="dxa"/>
-            </w:tcMar>
-          </w:tcPr>
-          <w:p>
-            <w:pPr>
-              <w:spacing w:before="0" w:after="0"/>
-            </w:pPr>
-            <w:r>
-              <w:rPr>
-                <w:rFonts w:ascii="Arial" w:hAnsi="Arial"/>
-                <w:color w:val="1E293B"/>
-                <w:sz w:val="17"/>
-              </w:rPr>
-              <w:t>Google se verify karke user ka name, email, aur profile photo profile card mein dikhata hai.</w:t>
+              <w:t>Zero-shot validation test set</w:t>
             </w:r>
           </w:p>
         </w:tc>
@@ -1035,722 +2289,13 @@
     </w:tbl>
     <w:p>
       <w:pPr>
-        <w:spacing w:after="160"/>
-      </w:pPr>
-    </w:p>
-    <w:p>
-      <w:pPr>
-        <w:keepNext/>
-        <w:spacing w:before="320" w:after="120"/>
-      </w:pPr>
-      <w:r>
-        <w:rPr>
-          <w:rFonts w:ascii="Arial" w:hAnsi="Arial"/>
-          <w:b/>
-          <w:color w:val="0E7490"/>
-          <w:sz w:val="32"/>
-        </w:rPr>
-        <w:t>3. Kaha Par Kya Stored Hai? (Folder Structure Explained)</w:t>
-      </w:r>
-    </w:p>
-    <w:p>
-      <w:pPr>
-        <w:spacing w:before="0" w:after="80" w:line="276" w:lineRule="auto"/>
-      </w:pPr>
-      <w:r>
-        <w:rPr>
-          <w:rFonts w:ascii="Arial" w:hAnsi="Arial"/>
-          <w:color w:val="334155"/>
-          <w:sz w:val="21"/>
-        </w:rPr>
-        <w:t>Project ke andar bohot saari files hain, lekin confuse hone ki bilkul zaroorat nahi hai! Dekho yaha par humne sab kuch kitne saaf tareeqe se organize kiya hua hai:</w:t>
-      </w:r>
-    </w:p>
-    <w:p>
-      <w:pPr>
-        <w:pStyle w:val="ListBullet"/>
-        <w:spacing w:before="20" w:after="60" w:line="276" w:lineRule="auto"/>
-      </w:pPr>
-      <w:r>
-        <w:rPr>
-          <w:rFonts w:ascii="Arial" w:hAnsi="Arial"/>
-          <w:b/>
-          <w:color w:val="0F172A"/>
-          <w:sz w:val="21"/>
-        </w:rPr>
-        <w:t xml:space="preserve">📁 netra/frontend/ : </w:t>
-      </w:r>
-      <w:r>
-        <w:rPr>
-          <w:rFonts w:ascii="Arial" w:hAnsi="Arial"/>
-          <w:color w:val="334155"/>
-          <w:sz w:val="21"/>
-        </w:rPr>
-        <w:t>Yeh hamari Website ka pura code hai. Yaha par React components, CSS styling, pages, aur icons hain.</w:t>
-      </w:r>
-    </w:p>
-    <w:p>
-      <w:pPr>
-        <w:pStyle w:val="ListBullet"/>
-        <w:spacing w:before="20" w:after="60" w:line="276" w:lineRule="auto"/>
-      </w:pPr>
-      <w:r>
-        <w:rPr>
-          <w:rFonts w:ascii="Arial" w:hAnsi="Arial"/>
-          <w:b/>
-          <w:color w:val="0F172A"/>
-          <w:sz w:val="21"/>
-        </w:rPr>
-        <w:t xml:space="preserve">   ├─ app/page.tsx : </w:t>
-      </w:r>
-      <w:r>
-        <w:rPr>
-          <w:rFonts w:ascii="Arial" w:hAnsi="Arial"/>
-          <w:color w:val="334155"/>
-          <w:sz w:val="21"/>
-        </w:rPr>
-        <w:t>Main homepage jaha par 3D Eye Scanner aur quick detection tool hai.</w:t>
-      </w:r>
-    </w:p>
-    <w:p>
-      <w:pPr>
-        <w:pStyle w:val="ListBullet"/>
-        <w:spacing w:before="20" w:after="60" w:line="276" w:lineRule="auto"/>
-      </w:pPr>
-      <w:r>
-        <w:rPr>
-          <w:rFonts w:ascii="Arial" w:hAnsi="Arial"/>
-          <w:b/>
-          <w:color w:val="0F172A"/>
-          <w:sz w:val="21"/>
-        </w:rPr>
-        <w:t xml:space="preserve">   ├─ app/radar/page.tsx : </w:t>
-      </w:r>
-      <w:r>
-        <w:rPr>
-          <w:rFonts w:ascii="Arial" w:hAnsi="Arial"/>
-          <w:color w:val="334155"/>
-          <w:sz w:val="21"/>
-        </w:rPr>
-        <w:t>Live Radar Map page jaha India ke live cyber crime alerts dikhte hain.</w:t>
-      </w:r>
-    </w:p>
-    <w:p>
-      <w:pPr>
-        <w:pStyle w:val="ListBullet"/>
-        <w:spacing w:before="20" w:after="60" w:line="276" w:lineRule="auto"/>
-      </w:pPr>
-      <w:r>
-        <w:rPr>
-          <w:rFonts w:ascii="Arial" w:hAnsi="Arial"/>
-          <w:b/>
-          <w:color w:val="0F172A"/>
-          <w:sz w:val="21"/>
-        </w:rPr>
-        <w:t xml:space="preserve">   ├─ app/reported/page.tsx : </w:t>
-      </w:r>
-      <w:r>
-        <w:rPr>
-          <w:rFonts w:ascii="Arial" w:hAnsi="Arial"/>
-          <w:color w:val="334155"/>
-          <w:sz w:val="21"/>
-        </w:rPr>
-        <w:t>Community reporting page jaha log fake accounts aur scam numbers report karte hain.</w:t>
-      </w:r>
-    </w:p>
-    <w:p>
-      <w:pPr>
-        <w:pStyle w:val="ListBullet"/>
-        <w:spacing w:before="20" w:after="60" w:line="276" w:lineRule="auto"/>
-      </w:pPr>
-      <w:r>
-        <w:rPr>
-          <w:rFonts w:ascii="Arial" w:hAnsi="Arial"/>
-          <w:b/>
-          <w:color w:val="0F172A"/>
-          <w:sz w:val="21"/>
-        </w:rPr>
-        <w:t xml:space="preserve">   ├─ app/developers/page.tsx : </w:t>
-      </w:r>
-      <w:r>
-        <w:rPr>
-          <w:rFonts w:ascii="Arial" w:hAnsi="Arial"/>
-          <w:color w:val="334155"/>
-          <w:sz w:val="21"/>
-        </w:rPr>
-        <w:t>Developer portal jaha se external programmers API key le sakte hain.</w:t>
-      </w:r>
-    </w:p>
-    <w:p>
-      <w:pPr>
-        <w:pStyle w:val="ListBullet"/>
-        <w:spacing w:before="20" w:after="60" w:line="276" w:lineRule="auto"/>
-      </w:pPr>
-      <w:r>
-        <w:rPr>
-          <w:rFonts w:ascii="Arial" w:hAnsi="Arial"/>
-          <w:b/>
-          <w:color w:val="0F172A"/>
-          <w:sz w:val="21"/>
-        </w:rPr>
-        <w:t xml:space="preserve">   └─ components/NetraEyeScanner.tsx : </w:t>
-      </w:r>
-      <w:r>
-        <w:rPr>
-          <w:rFonts w:ascii="Arial" w:hAnsi="Arial"/>
-          <w:color w:val="334155"/>
-          <w:sz w:val="21"/>
-        </w:rPr>
-        <w:t>Woh futuristic 3D Eye Scanner jo lasers aur animations se file scan karta hai.</w:t>
-      </w:r>
-    </w:p>
-    <w:p>
-      <w:pPr>
-        <w:pStyle w:val="ListBullet"/>
-        <w:spacing w:before="20" w:after="60" w:line="276" w:lineRule="auto"/>
-      </w:pPr>
-      <w:r>
-        <w:rPr>
-          <w:rFonts w:ascii="Arial" w:hAnsi="Arial"/>
-          <w:b/>
-          <w:color w:val="0F172A"/>
-          <w:sz w:val="21"/>
-        </w:rPr>
-        <w:t xml:space="preserve">📁 netra/backend/ : </w:t>
-      </w:r>
-      <w:r>
-        <w:rPr>
-          <w:rFonts w:ascii="Arial" w:hAnsi="Arial"/>
-          <w:color w:val="334155"/>
-          <w:sz w:val="21"/>
-        </w:rPr>
-        <w:t>Yeh hamara Server aur API brain hai jaha FastAPI aur database rehta hai.</w:t>
-      </w:r>
-    </w:p>
-    <w:p>
-      <w:pPr>
-        <w:pStyle w:val="ListBullet"/>
-        <w:spacing w:before="20" w:after="60" w:line="276" w:lineRule="auto"/>
-      </w:pPr>
-      <w:r>
-        <w:rPr>
-          <w:rFonts w:ascii="Arial" w:hAnsi="Arial"/>
-          <w:b/>
-          <w:color w:val="0F172A"/>
-          <w:sz w:val="21"/>
-        </w:rPr>
-        <w:t xml:space="preserve">   ├─ api/server.py : </w:t>
-      </w:r>
-      <w:r>
-        <w:rPr>
-          <w:rFonts w:ascii="Arial" w:hAnsi="Arial"/>
-          <w:color w:val="334155"/>
-          <w:sz w:val="21"/>
-        </w:rPr>
-        <w:t>Main backend starting point jaha se saari APIs connect hoti hain.</w:t>
-      </w:r>
-    </w:p>
-    <w:p>
-      <w:pPr>
-        <w:pStyle w:val="ListBullet"/>
-        <w:spacing w:before="20" w:after="60" w:line="276" w:lineRule="auto"/>
-      </w:pPr>
-      <w:r>
-        <w:rPr>
-          <w:rFonts w:ascii="Arial" w:hAnsi="Arial"/>
-          <w:b/>
-          <w:color w:val="0F172A"/>
-          <w:sz w:val="21"/>
-        </w:rPr>
-        <w:t xml:space="preserve">   ├─ api/db.py : </w:t>
-      </w:r>
-      <w:r>
-        <w:rPr>
-          <w:rFonts w:ascii="Arial" w:hAnsi="Arial"/>
-          <w:color w:val="334155"/>
-          <w:sz w:val="21"/>
-        </w:rPr>
-        <w:t>SQLite database logic jo users, scan history, aur threat data manage karta hai.</w:t>
-      </w:r>
-    </w:p>
-    <w:p>
-      <w:pPr>
-        <w:pStyle w:val="ListBullet"/>
-        <w:spacing w:before="20" w:after="60" w:line="276" w:lineRule="auto"/>
-      </w:pPr>
-      <w:r>
-        <w:rPr>
-          <w:rFonts w:ascii="Arial" w:hAnsi="Arial"/>
-          <w:b/>
-          <w:color w:val="0F172A"/>
-          <w:sz w:val="21"/>
-        </w:rPr>
-        <w:t xml:space="preserve">   ├─ api/auth.py : </w:t>
-      </w:r>
-      <w:r>
-        <w:rPr>
-          <w:rFonts w:ascii="Arial" w:hAnsi="Arial"/>
-          <w:color w:val="334155"/>
-          <w:sz w:val="21"/>
-        </w:rPr>
-        <w:t>Google Login aur user authentication verify karne wali file.</w:t>
-      </w:r>
-    </w:p>
-    <w:p>
-      <w:pPr>
-        <w:pStyle w:val="ListBullet"/>
-        <w:spacing w:before="20" w:after="60" w:line="276" w:lineRule="auto"/>
-      </w:pPr>
-      <w:r>
-        <w:rPr>
-          <w:rFonts w:ascii="Arial" w:hAnsi="Arial"/>
-          <w:b/>
-          <w:color w:val="0F172A"/>
-          <w:sz w:val="21"/>
-        </w:rPr>
-        <w:t xml:space="preserve">   ├─ api/netra.db : </w:t>
-      </w:r>
-      <w:r>
-        <w:rPr>
-          <w:rFonts w:ascii="Arial" w:hAnsi="Arial"/>
-          <w:color w:val="334155"/>
-          <w:sz w:val="21"/>
-        </w:rPr>
-        <w:t>Asli database file jaha sara data permanently save hota hai.</w:t>
-      </w:r>
-    </w:p>
-    <w:p>
-      <w:pPr>
-        <w:pStyle w:val="ListBullet"/>
-        <w:spacing w:before="20" w:after="60" w:line="276" w:lineRule="auto"/>
-      </w:pPr>
-      <w:r>
-        <w:rPr>
-          <w:rFonts w:ascii="Arial" w:hAnsi="Arial"/>
-          <w:b/>
-          <w:color w:val="0F172A"/>
-          <w:sz w:val="21"/>
-        </w:rPr>
-        <w:t xml:space="preserve">   └─ services/tavily_crawler.py : </w:t>
-      </w:r>
-      <w:r>
-        <w:rPr>
-          <w:rFonts w:ascii="Arial" w:hAnsi="Arial"/>
-          <w:color w:val="334155"/>
-          <w:sz w:val="21"/>
-        </w:rPr>
-        <w:t>24 ghante background mein chalne wala news bot jo live scams internet se nikaalta hai.</w:t>
-      </w:r>
-    </w:p>
-    <w:p>
-      <w:pPr>
-        <w:pStyle w:val="ListBullet"/>
-        <w:spacing w:before="20" w:after="60" w:line="276" w:lineRule="auto"/>
-      </w:pPr>
-      <w:r>
-        <w:rPr>
-          <w:rFonts w:ascii="Arial" w:hAnsi="Arial"/>
-          <w:b/>
-          <w:color w:val="0F172A"/>
-          <w:sz w:val="21"/>
-        </w:rPr>
-        <w:t xml:space="preserve">📁 netra/pipeline/ : </w:t>
-      </w:r>
-      <w:r>
-        <w:rPr>
-          <w:rFonts w:ascii="Arial" w:hAnsi="Arial"/>
-          <w:color w:val="334155"/>
-          <w:sz w:val="21"/>
-        </w:rPr>
-        <w:t>Forensic Deepfake Detection ke 4 Super Detectives (Pillars) yaha rehte hain:</w:t>
-      </w:r>
-    </w:p>
-    <w:p>
-      <w:pPr>
-        <w:pStyle w:val="ListBullet"/>
-        <w:spacing w:before="20" w:after="60" w:line="276" w:lineRule="auto"/>
-      </w:pPr>
-      <w:r>
-        <w:rPr>
-          <w:rFonts w:ascii="Arial" w:hAnsi="Arial"/>
-          <w:b/>
-          <w:color w:val="0F172A"/>
-          <w:sz w:val="21"/>
-        </w:rPr>
-        <w:t xml:space="preserve">   ├─ forensic_arbiter.py : </w:t>
-      </w:r>
-      <w:r>
-        <w:rPr>
-          <w:rFonts w:ascii="Arial" w:hAnsi="Arial"/>
-          <w:color w:val="334155"/>
-          <w:sz w:val="21"/>
-        </w:rPr>
-        <w:t>Master Head jo chaaron detection results ko ek sath combine karke final verdict deta hai.</w:t>
-      </w:r>
-    </w:p>
-    <w:p>
-      <w:pPr>
-        <w:pStyle w:val="ListBullet"/>
-        <w:spacing w:before="20" w:after="60" w:line="276" w:lineRule="auto"/>
-      </w:pPr>
-      <w:r>
-        <w:rPr>
-          <w:rFonts w:ascii="Arial" w:hAnsi="Arial"/>
-          <w:b/>
-          <w:color w:val="0F172A"/>
-          <w:sz w:val="21"/>
-        </w:rPr>
-        <w:t xml:space="preserve">   ├─ corneal_specular_physics.py : </w:t>
-      </w:r>
-      <w:r>
-        <w:rPr>
-          <w:rFonts w:ascii="Arial" w:hAnsi="Arial"/>
-          <w:color w:val="334155"/>
-          <w:sz w:val="21"/>
-        </w:rPr>
-        <w:t>Aankhon ke andar light reflection check karne wala module.</w:t>
-      </w:r>
-    </w:p>
-    <w:p>
-      <w:pPr>
-        <w:pStyle w:val="ListBullet"/>
-        <w:spacing w:before="20" w:after="60" w:line="276" w:lineRule="auto"/>
-      </w:pPr>
-      <w:r>
-        <w:rPr>
-          <w:rFonts w:ascii="Arial" w:hAnsi="Arial"/>
-          <w:b/>
-          <w:color w:val="0F172A"/>
-          <w:sz w:val="21"/>
-        </w:rPr>
-        <w:t xml:space="preserve">   ├─ rppg_vascular_pulse.py : </w:t>
-      </w:r>
-      <w:r>
-        <w:rPr>
-          <w:rFonts w:ascii="Arial" w:hAnsi="Arial"/>
-          <w:color w:val="334155"/>
-          <w:sz w:val="21"/>
-        </w:rPr>
-        <w:t>Skin color ke micro-changes se heartbeat (pulse) detect karne wala module.</w:t>
-      </w:r>
-    </w:p>
-    <w:p>
-      <w:pPr>
-        <w:pStyle w:val="ListBullet"/>
-        <w:spacing w:before="20" w:after="60" w:line="276" w:lineRule="auto"/>
-      </w:pPr>
-      <w:r>
-        <w:rPr>
-          <w:rFonts w:ascii="Arial" w:hAnsi="Arial"/>
-          <w:b/>
-          <w:color w:val="0F172A"/>
-          <w:sz w:val="21"/>
-        </w:rPr>
-        <w:t xml:space="preserve">   └─ audiovisual_sync.py : </w:t>
-      </w:r>
-      <w:r>
-        <w:rPr>
-          <w:rFonts w:ascii="Arial" w:hAnsi="Arial"/>
-          <w:color w:val="334155"/>
-          <w:sz w:val="21"/>
-        </w:rPr>
-        <w:t>Lips movement aur audio ki matching pakadne wala module.</w:t>
-      </w:r>
-    </w:p>
-    <w:p>
-      <w:pPr>
-        <w:pStyle w:val="ListBullet"/>
-        <w:spacing w:before="20" w:after="60" w:line="276" w:lineRule="auto"/>
-      </w:pPr>
-      <w:r>
-        <w:rPr>
-          <w:rFonts w:ascii="Arial" w:hAnsi="Arial"/>
-          <w:b/>
-          <w:color w:val="0F172A"/>
-          <w:sz w:val="21"/>
-        </w:rPr>
-        <w:t xml:space="preserve">📁 netra/training/ : </w:t>
-      </w:r>
-      <w:r>
-        <w:rPr>
-          <w:rFonts w:ascii="Arial" w:hAnsi="Arial"/>
-          <w:color w:val="334155"/>
-          <w:sz w:val="21"/>
-        </w:rPr>
-        <w:t>AI model ko train karne ki factory. Yaha dataset builder aur neural network loss functions hain.</w:t>
-      </w:r>
-    </w:p>
-    <w:p>
-      <w:pPr>
-        <w:pStyle w:val="ListBullet"/>
-        <w:spacing w:before="20" w:after="60" w:line="276" w:lineRule="auto"/>
-      </w:pPr>
-      <w:r>
-        <w:rPr>
-          <w:rFonts w:ascii="Arial" w:hAnsi="Arial"/>
-          <w:b/>
-          <w:color w:val="0F172A"/>
-          <w:sz w:val="21"/>
-        </w:rPr>
-        <w:t xml:space="preserve">📁 netra/benchmark_reports/ : </w:t>
-      </w:r>
-      <w:r>
-        <w:rPr>
-          <w:rFonts w:ascii="Arial" w:hAnsi="Arial"/>
-          <w:color w:val="334155"/>
-          <w:sz w:val="21"/>
-        </w:rPr>
-        <w:t>100-video benchmark tests ke sabhi PDF, CSV aur JSON report proofs yaha stored hain.</w:t>
-      </w:r>
-    </w:p>
-    <w:p>
-      <w:pPr>
-        <w:pStyle w:val="ListBullet"/>
-        <w:spacing w:before="20" w:after="60" w:line="276" w:lineRule="auto"/>
-      </w:pPr>
-      <w:r>
-        <w:rPr>
-          <w:rFonts w:ascii="Arial" w:hAnsi="Arial"/>
-          <w:b/>
-          <w:color w:val="0F172A"/>
-          <w:sz w:val="21"/>
-        </w:rPr>
-        <w:t xml:space="preserve">📁 netra/scripts/ : </w:t>
-      </w:r>
-      <w:r>
-        <w:rPr>
-          <w:rFonts w:ascii="Arial" w:hAnsi="Arial"/>
-          <w:color w:val="334155"/>
-          <w:sz w:val="21"/>
-        </w:rPr>
-        <w:t>Helper scripts jaise model download karna, test chalana, aur automated benchmarks.</w:t>
-      </w:r>
-    </w:p>
-    <w:p>
-      <w:pPr>
-        <w:pStyle w:val="ListBullet"/>
-        <w:spacing w:before="20" w:after="60" w:line="276" w:lineRule="auto"/>
-      </w:pPr>
-      <w:r>
-        <w:rPr>
-          <w:rFonts w:ascii="Arial" w:hAnsi="Arial"/>
-          <w:b/>
-          <w:color w:val="0F172A"/>
-          <w:sz w:val="21"/>
-        </w:rPr>
-        <w:t xml:space="preserve">📁 netra/tests/ : </w:t>
-      </w:r>
-      <w:r>
-        <w:rPr>
-          <w:rFonts w:ascii="Arial" w:hAnsi="Arial"/>
-          <w:color w:val="334155"/>
-          <w:sz w:val="21"/>
-        </w:rPr>
-        <w:t>Automated unit tests jo check karte hain ki 4-Pillars theek se kaam kar rahe hain ya nahi.</w:t>
-      </w:r>
-    </w:p>
-    <w:p>
-      <w:pPr>
         <w:spacing w:after="120"/>
       </w:pPr>
-    </w:p>
-    <w:p>
-      <w:pPr>
-        <w:keepNext/>
-        <w:spacing w:before="320" w:after="120"/>
-      </w:pPr>
-      <w:r>
-        <w:rPr>
-          <w:rFonts w:ascii="Arial" w:hAnsi="Arial"/>
-          <w:b/>
-          <w:color w:val="0E7490"/>
-          <w:sz w:val="32"/>
-        </w:rPr>
-        <w:t>4. Deepfake Kaise Pakadte Hain? (The 4-Pillar Magic Explained)</w:t>
-      </w:r>
-    </w:p>
-    <w:p>
-      <w:pPr>
-        <w:spacing w:before="0" w:after="80" w:line="276" w:lineRule="auto"/>
-      </w:pPr>
-      <w:r>
-        <w:rPr>
-          <w:rFonts w:ascii="Arial" w:hAnsi="Arial"/>
-          <w:color w:val="334155"/>
-          <w:sz w:val="21"/>
-        </w:rPr>
-        <w:t>Normal AI models sirf image ko dekhte hain aur dhokha kha jaate hain. Par NETRA 4 alag-alag angles se attack karta hai! Isko hum bolte hain '4-Pillar Forensic Defense':</w:t>
-      </w:r>
-    </w:p>
-    <w:p>
-      <w:pPr>
-        <w:keepNext/>
-        <w:spacing w:before="240" w:after="80"/>
-      </w:pPr>
-      <w:r>
-        <w:rPr>
-          <w:rFonts w:ascii="Arial" w:hAnsi="Arial"/>
-          <w:b/>
-          <w:color w:val="4F46E5"/>
-          <w:sz w:val="26"/>
-        </w:rPr>
-        <w:t>🔍 Pillar 1: Spatial Artifact Inspection (Pixel Level Checking)</w:t>
-      </w:r>
-    </w:p>
-    <w:p>
-      <w:pPr>
-        <w:spacing w:before="0" w:after="80" w:line="276" w:lineRule="auto"/>
-      </w:pPr>
-      <w:r>
-        <w:rPr>
-          <w:rFonts w:ascii="Arial" w:hAnsi="Arial"/>
-          <w:color w:val="334155"/>
-          <w:sz w:val="21"/>
-        </w:rPr>
-        <w:t>👉 Asli Zindagi Example: Jaise koi photo par scissors se chehra kaat ke doosre chehre par chipkaye, toh edges par halki si line ya blur reh jaata hai!</w:t>
-      </w:r>
-    </w:p>
-    <w:p>
-      <w:pPr>
-        <w:spacing w:before="0" w:after="80" w:line="276" w:lineRule="auto"/>
-      </w:pPr>
-      <w:r>
-        <w:rPr>
-          <w:rFonts w:ascii="Arial" w:hAnsi="Arial"/>
-          <w:color w:val="334155"/>
-          <w:sz w:val="21"/>
-        </w:rPr>
-        <w:t>👉 NETRA Kya Karta Hai: Humara EfficientNet-B4 AI model chehre ke boundaries, gaalon ke textures, aur earlobe blending ko zoom karke dekhta hai. Agar generator AI ne pixels ko warp kiya ho, toh ye turant pakad leta hai.</w:t>
-      </w:r>
-    </w:p>
-    <w:p>
-      <w:pPr>
-        <w:keepNext/>
-        <w:spacing w:before="240" w:after="80"/>
-      </w:pPr>
-      <w:r>
-        <w:rPr>
-          <w:rFonts w:ascii="Arial" w:hAnsi="Arial"/>
-          <w:b/>
-          <w:color w:val="4F46E5"/>
-          <w:sz w:val="26"/>
-        </w:rPr>
-        <w:t>👄 Pillar 2: Indic Phoneme-Viseme Sync (Lips vs Voice Alignment)</w:t>
-      </w:r>
-    </w:p>
-    <w:p>
-      <w:pPr>
-        <w:spacing w:before="0" w:after="80" w:line="276" w:lineRule="auto"/>
-      </w:pPr>
-      <w:r>
-        <w:rPr>
-          <w:rFonts w:ascii="Arial" w:hAnsi="Arial"/>
-          <w:color w:val="334155"/>
-          <w:sz w:val="21"/>
-        </w:rPr>
-        <w:t>👉 Asli Zindagi Example: Jab tum 'Bolo' bolte ho toh tumhare lips band hoke khulte hain ('B'). Agar audio mein 'B' bole aur lips 'O' bane rahein, toh pakda gaya jhooth!</w:t>
-      </w:r>
-    </w:p>
-    <w:p>
-      <w:pPr>
-        <w:spacing w:before="0" w:after="80" w:line="276" w:lineRule="auto"/>
-      </w:pPr>
-      <w:r>
-        <w:rPr>
-          <w:rFonts w:ascii="Arial" w:hAnsi="Arial"/>
-          <w:color w:val="334155"/>
-          <w:sz w:val="21"/>
-        </w:rPr>
-        <w:t>👉 NETRA Kya Karta Hai: Yeh Indian languages (Hindi, Tamil, Telugu, etc.) ke biomechanics check karta hai. Voice ke sound units (Phonemes) aur honthon ki shape (Visemes) ko millisecond accuracy ke sath match karta hai.</w:t>
-      </w:r>
-    </w:p>
-    <w:p>
-      <w:pPr>
-        <w:keepNext/>
-        <w:spacing w:before="240" w:after="80"/>
-      </w:pPr>
-      <w:r>
-        <w:rPr>
-          <w:rFonts w:ascii="Arial" w:hAnsi="Arial"/>
-          <w:b/>
-          <w:color w:val="4F46E5"/>
-          <w:sz w:val="26"/>
-        </w:rPr>
-        <w:t>👁️ Pillar 3: Corneal Specular Physics (Aankhon Mein Light Reflection)</w:t>
-      </w:r>
-    </w:p>
-    <w:p>
-      <w:pPr>
-        <w:spacing w:before="0" w:after="80" w:line="276" w:lineRule="auto"/>
-      </w:pPr>
-      <w:r>
-        <w:rPr>
-          <w:rFonts w:ascii="Arial" w:hAnsi="Arial"/>
-          <w:color w:val="334155"/>
-          <w:sz w:val="21"/>
-        </w:rPr>
-        <w:t>👉 Asli Zindagi Example: Agar tum kamre mein khade ho jaha samne 1 tube light jal rahi hai, toh tumhari Dono Aankhon mein bilkul ek jaisi light chamkegi!</w:t>
-      </w:r>
-    </w:p>
-    <w:p>
-      <w:pPr>
-        <w:spacing w:before="0" w:after="80" w:line="276" w:lineRule="auto"/>
-      </w:pPr>
-      <w:r>
-        <w:rPr>
-          <w:rFonts w:ascii="Arial" w:hAnsi="Arial"/>
-          <w:color w:val="334155"/>
-          <w:sz w:val="21"/>
-        </w:rPr>
-        <w:t>👉 NETRA Kya Karta Hai: Deepfake AI models dono aankhon ki 3D physics theek se render nahi kar paate. NETRA right eye aur left eye ke cornea mein banne wali light reflection ka 3D angle match karta hai. Agar left eye mein light alag aur right eye mein alag hai, toh 100% DEEPFAKE hai!</w:t>
-      </w:r>
-    </w:p>
-    <w:p>
-      <w:pPr>
-        <w:keepNext/>
-        <w:spacing w:before="240" w:after="80"/>
-      </w:pPr>
-      <w:r>
-        <w:rPr>
-          <w:rFonts w:ascii="Arial" w:hAnsi="Arial"/>
-          <w:b/>
-          <w:color w:val="4F46E5"/>
-          <w:sz w:val="26"/>
-        </w:rPr>
-        <w:t>💓 Pillar 4: Melanin-Calibrated rPPG (Heartbeat &amp; Blood Flow)</w:t>
-      </w:r>
-    </w:p>
-    <w:p>
-      <w:pPr>
-        <w:spacing w:before="0" w:after="80" w:line="276" w:lineRule="auto"/>
-      </w:pPr>
-      <w:r>
-        <w:rPr>
-          <w:rFonts w:ascii="Arial" w:hAnsi="Arial"/>
-          <w:color w:val="334155"/>
-          <w:sz w:val="21"/>
-        </w:rPr>
-        <w:t>👉 Asli Zindagi Example: Har baar jab insaan ka dil dhadakta hai, toh uske chehre ki skin mein khoon flow hota hai, jisse skin ka rang microscopic level par halka sa change hota hai jo aam aankhon se nahi dikhta.</w:t>
-      </w:r>
-    </w:p>
-    <w:p>
-      <w:pPr>
-        <w:spacing w:before="0" w:after="80" w:line="276" w:lineRule="auto"/>
-      </w:pPr>
-      <w:r>
-        <w:rPr>
-          <w:rFonts w:ascii="Arial" w:hAnsi="Arial"/>
-          <w:color w:val="334155"/>
-          <w:sz w:val="21"/>
-        </w:rPr>
-        <w:t>👉 NETRA Kya Karta Hai: Yeh camera video se bina touch kiye insaan ki heartbeat (rPPG pulse) naap leta hai! Aur ye khas tor par Indian / South Asian skin tones (Fitzpatrick type III-VI) ke liye calibrated hai. AI video mein dil nahi dhadakta, isliye fake video pakdi jaati hai!</w:t>
-      </w:r>
     </w:p>
     <w:tbl>
       <w:tblPr>
         <w:tblW w:type="auto" w:w="0"/>
         <w:jc w:val="center"/>
-        <w:tblLayout w:type="fixed"/>
         <w:tblLook w:firstColumn="1" w:firstRow="1" w:lastColumn="0" w:lastRow="0" w:noHBand="0" w:noVBand="1" w:val="04A0"/>
       </w:tblPr>
       <w:tblGrid>
@@ -1759,59 +2304,64 @@
       <w:tr>
         <w:tc>
           <w:tcPr>
-            <w:tcW w:type="dxa" w:w="9360"/>
-            <w:shd w:fill="FEF3C7"/>
+            <w:tcW w:type="dxa" w:w="9792"/>
+            <w:shd w:fill="FFFBEB" w:val="clear"/>
             <w:tcMar>
-              <w:top w:w="160" w:type="dxa"/>
-              <w:bottom w:w="160" w:type="dxa"/>
-              <w:left w:w="240" w:type="dxa"/>
-              <w:right w:w="200" w:type="dxa"/>
+              <w:top w:w="140" w:type="dxa"/>
+              <w:bottom w:w="140" w:type="dxa"/>
+              <w:left w:w="180" w:type="dxa"/>
+              <w:right w:w="180" w:type="dxa"/>
             </w:tcMar>
             <w:tcBorders>
               <w:top w:val="none"/>
-              <w:left w:val="single" w:sz="24" w:space="0" w:color="F59E0B"/>
+              <w:right w:val="none"/>
               <w:bottom w:val="none"/>
-              <w:right w:val="none"/>
+              <w:left w:val="single" w:sz="32" w:color="F59E0B"/>
             </w:tcBorders>
           </w:tcPr>
           <w:p>
             <w:pPr>
-              <w:spacing w:before="40" w:after="80"/>
+              <w:spacing w:after="80"/>
             </w:pPr>
             <w:r>
               <w:rPr>
                 <w:rFonts w:ascii="Arial" w:hAnsi="Arial"/>
                 <w:b/>
-                <w:color w:val="104628"/>
+                <w:i w:val="0"/>
+                <w:color w:val="78350F"/>
                 <w:sz w:val="22"/>
               </w:rPr>
-              <w:t>⚖️ Master Forensic Arbiter</w:t>
+              <w:t>🔒 Strict Rule: Zero Data Leakage!</w:t>
             </w:r>
           </w:p>
           <w:p>
             <w:pPr>
-              <w:spacing w:before="40" w:after="40"/>
+              <w:spacing w:before="20" w:after="40"/>
             </w:pPr>
             <w:r>
               <w:rPr>
                 <w:rFonts w:ascii="Arial" w:hAnsi="Arial"/>
+                <w:b w:val="0"/>
+                <w:i w:val="0"/>
                 <w:color w:val="1E293B"/>
-                <w:sz w:val="20"/>
+                <w:sz w:val="21"/>
               </w:rPr>
-              <w:t>Forensic Arbiter: In charo detectors ka score ek mathematical equation mein fuse hota hai.</w:t>
+              <w:t>Hamare jo 100 Indian celebrity benchmark videos aur 78 test swaps hain, unhe KABHI BHI training mein use nahi kiya gaya.</w:t>
             </w:r>
           </w:p>
           <w:p>
             <w:pPr>
-              <w:spacing w:before="40" w:after="40"/>
+              <w:spacing w:before="20" w:after="40"/>
             </w:pPr>
             <w:r>
               <w:rPr>
                 <w:rFonts w:ascii="Arial" w:hAnsi="Arial"/>
+                <w:b w:val="0"/>
+                <w:i w:val="0"/>
                 <w:color w:val="1E293B"/>
-                <w:sz w:val="20"/>
+                <w:sz w:val="21"/>
               </w:rPr>
-              <w:t>Final Verdict nikalta hai: 'AUTHENTIC' ya 'DEEPFAKE DETECTED', sath mein confidence score (jaise 98.4%) aur court-ready forensic breakdown!</w:t>
+              <w:t>Woh 100% held-out test set the taaki judges ko real zero-shot generalization dikhai ja sake!</w:t>
             </w:r>
           </w:p>
         </w:tc>
@@ -1824,902 +2374,271 @@
     </w:p>
     <w:p>
       <w:pPr>
+        <w:spacing w:before="80" w:after="80"/>
+        <w:pBdr>
+          <w:bottom w:val="single" w:sz="4" w:color="CBD5E1"/>
+        </w:pBdr>
+      </w:pPr>
+    </w:p>
+    <w:p>
+      <w:pPr>
         <w:keepNext/>
-        <w:spacing w:before="320" w:after="120"/>
+        <w:spacing w:before="360" w:after="120"/>
       </w:pPr>
       <w:r>
         <w:rPr>
           <w:rFonts w:ascii="Arial" w:hAnsi="Arial"/>
           <w:b/>
-          <w:color w:val="0E7490"/>
-          <w:sz w:val="32"/>
+          <w:i w:val="0"/>
+          <w:color w:val="075985"/>
+          <w:sz w:val="30"/>
         </w:rPr>
-        <w:t>5. Step-by-Step Kaam Kaise Karta Hai? (User Journey)</w:t>
+        <w:t>5. 🏛️ The 4 Physical &amp; Biological Pillars (AI Physics Nahi Tod Sakta)</w:t>
       </w:r>
     </w:p>
     <w:p>
       <w:pPr>
-        <w:spacing w:before="0" w:after="80" w:line="276" w:lineRule="auto"/>
+        <w:spacing w:before="0" w:after="100" w:line="283" w:lineRule="auto"/>
       </w:pPr>
       <w:r>
         <w:rPr>
           <w:rFonts w:ascii="Arial" w:hAnsi="Arial"/>
+          <w:b w:val="0"/>
+          <w:i w:val="0"/>
           <w:color w:val="334155"/>
           <w:sz w:val="21"/>
         </w:rPr>
-        <w:t>Chalo dekhte hain jab koi user website par aakar video check karta hai toh parde ke peeche kya hota hai:</w:t>
+        <w:t>GenAI kitna bhi realistic video bana le, woh real-world biological aur physical rules ko follow nahi kar pata. Isliye NETRA 4 physical pillars use karta hai:</w:t>
       </w:r>
     </w:p>
     <w:p>
       <w:pPr>
-        <w:pStyle w:val="ListBullet"/>
-        <w:spacing w:before="20" w:after="60" w:line="276" w:lineRule="auto"/>
+        <w:keepNext/>
+        <w:spacing w:before="260" w:after="80"/>
       </w:pPr>
       <w:r>
         <w:rPr>
           <w:rFonts w:ascii="Arial" w:hAnsi="Arial"/>
           <w:b/>
-          <w:color w:val="0F172A"/>
-          <w:sz w:val="21"/>
+          <w:i w:val="0"/>
+          <w:color w:val="4338CA"/>
+          <w:sz w:val="25"/>
         </w:rPr>
-        <w:t xml:space="preserve">Step 1 (Upload): </w:t>
-      </w:r>
-      <w:r>
-        <w:rPr>
-          <w:rFonts w:ascii="Arial" w:hAnsi="Arial"/>
-          <w:color w:val="334155"/>
-          <w:sz w:val="21"/>
-        </w:rPr>
-        <w:t>User homepage par jaakar koi bhi photo ya video drag-and-drop karta hai.</w:t>
+        <w:t>Pillar 1: Spatial &amp; Hyperspherical Invariant (netra_v2.py)</w:t>
       </w:r>
     </w:p>
     <w:p>
       <w:pPr>
-        <w:pStyle w:val="ListBullet"/>
-        <w:spacing w:before="20" w:after="60" w:line="276" w:lineRule="auto"/>
+        <w:spacing w:before="0" w:after="100" w:line="283" w:lineRule="auto"/>
+      </w:pPr>
+      <w:r>
+        <w:rPr>
+          <w:rFonts w:ascii="Arial" w:hAnsi="Arial"/>
+          <w:b w:val="0"/>
+          <w:i w:val="0"/>
+          <w:color w:val="334155"/>
+          <w:sz w:val="21"/>
+        </w:rPr>
+        <w:t>EfficientNet-B4 + LinearNormHead unit sphere par pixel residuals aur blending boundaries ko scan karta hai bina lighting se distract hue.</w:t>
+      </w:r>
+    </w:p>
+    <w:p>
+      <w:pPr>
+        <w:keepNext/>
+        <w:spacing w:before="260" w:after="80"/>
       </w:pPr>
       <w:r>
         <w:rPr>
           <w:rFonts w:ascii="Arial" w:hAnsi="Arial"/>
           <w:b/>
-          <w:color w:val="0F172A"/>
-          <w:sz w:val="21"/>
+          <w:i w:val="0"/>
+          <w:color w:val="4338CA"/>
+          <w:sz w:val="25"/>
         </w:rPr>
-        <w:t xml:space="preserve">Step 2 (3D Eye Scan): </w:t>
-      </w:r>
-      <w:r>
-        <w:rPr>
-          <w:rFonts w:ascii="Arial" w:hAnsi="Arial"/>
-          <w:color w:val="334155"/>
-          <w:sz w:val="21"/>
-        </w:rPr>
-        <w:t>Frontend par NetraEyeScanner active hota hai—audio laser sound play hota hai aur 3D eye video ko scan karti hui animation dikhati hai.</w:t>
+        <w:t>Pillar 2: Indic Phoneme-Viseme Biomechanics (audiovisual_sync.py)</w:t>
       </w:r>
     </w:p>
     <w:p>
       <w:pPr>
-        <w:pStyle w:val="ListBullet"/>
-        <w:spacing w:before="20" w:after="60" w:line="276" w:lineRule="auto"/>
+        <w:spacing w:before="0" w:after="100" w:line="283" w:lineRule="auto"/>
+      </w:pPr>
+      <w:r>
+        <w:rPr>
+          <w:rFonts w:ascii="Arial" w:hAnsi="Arial"/>
+          <w:b w:val="0"/>
+          <w:i w:val="0"/>
+          <w:color w:val="334155"/>
+          <w:sz w:val="21"/>
+        </w:rPr>
+        <w:t>Indian languages (Hindi, Tamil, Telugu) mein specific akshar hote hain jaise retroflex consonants (ट, ठ, ड, ण). Inhe bolte waqt zubaan aur hontho ki speed (lip-aperture deceleration) natural human body physics follow karti hai.</w:t>
+      </w:r>
+    </w:p>
+    <w:p>
+      <w:pPr>
+        <w:spacing w:before="0" w:after="100" w:line="283" w:lineRule="auto"/>
+      </w:pPr>
+      <w:r>
+        <w:rPr>
+          <w:rFonts w:ascii="Arial" w:hAnsi="Arial"/>
+          <w:b w:val="0"/>
+          <w:i w:val="0"/>
+          <w:color w:val="334155"/>
+          <w:sz w:val="21"/>
+        </w:rPr>
+        <w:t>Wav2Lip ya LivePortrait jaise AI models English audio par trained hain — woh Indian phonemes pe linear fake lip movement karte hain jo NETRA ka ACCI algorithm millisecond mein pakad leta hai.</w:t>
+      </w:r>
+    </w:p>
+    <w:p>
+      <w:pPr>
+        <w:keepNext/>
+        <w:spacing w:before="260" w:after="80"/>
       </w:pPr>
       <w:r>
         <w:rPr>
           <w:rFonts w:ascii="Arial" w:hAnsi="Arial"/>
           <w:b/>
-          <w:color w:val="0F172A"/>
-          <w:sz w:val="21"/>
+          <w:i w:val="0"/>
+          <w:color w:val="4338CA"/>
+          <w:sz w:val="25"/>
         </w:rPr>
-        <w:t xml:space="preserve">Step 3 (FastAPI Request): </w:t>
-      </w:r>
-      <w:r>
-        <w:rPr>
-          <w:rFonts w:ascii="Arial" w:hAnsi="Arial"/>
-          <w:color w:val="334155"/>
-          <w:sz w:val="21"/>
-        </w:rPr>
-        <w:t>Browser background mein file ko FastAPI endpoint `/api/v1/detect` par bhejta hai.</w:t>
+        <w:t>Pillar 3: 3D Corneal Specular Physics (corneal_specular_physics.py)</w:t>
       </w:r>
     </w:p>
     <w:p>
       <w:pPr>
-        <w:pStyle w:val="ListBullet"/>
-        <w:spacing w:before="20" w:after="60" w:line="276" w:lineRule="auto"/>
+        <w:spacing w:before="0" w:after="100" w:line="283" w:lineRule="auto"/>
+      </w:pPr>
+      <w:r>
+        <w:rPr>
+          <w:rFonts w:ascii="Arial" w:hAnsi="Arial"/>
+          <w:b w:val="0"/>
+          <w:i w:val="0"/>
+          <w:color w:val="334155"/>
+          <w:sz w:val="21"/>
+        </w:rPr>
+        <w:t>Real world mein dono aankhon ki putliyo (cornea) par light ka reflection (Purkinje reflections) ek specific 3D parallax angle match karta hai.</w:t>
+      </w:r>
+    </w:p>
+    <w:p>
+      <w:pPr>
+        <w:spacing w:before="0" w:after="100" w:line="283" w:lineRule="auto"/>
+      </w:pPr>
+      <w:r>
+        <w:rPr>
+          <w:rFonts w:ascii="Arial" w:hAnsi="Arial"/>
+          <w:b w:val="0"/>
+          <w:i w:val="0"/>
+          <w:color w:val="334155"/>
+          <w:sz w:val="21"/>
+        </w:rPr>
+        <w:t>2D deepfake models dono aankhon ki reflection ko 3D consistent nahi bana pate. Agar reflection angle disparity &gt; 8.5° aayi → 100% mathematical guarantee ki video FAKE hai.</w:t>
+      </w:r>
+    </w:p>
+    <w:p>
+      <w:pPr>
+        <w:keepNext/>
+        <w:spacing w:before="260" w:after="80"/>
       </w:pPr>
       <w:r>
         <w:rPr>
           <w:rFonts w:ascii="Arial" w:hAnsi="Arial"/>
           <w:b/>
-          <w:color w:val="0F172A"/>
-          <w:sz w:val="21"/>
+          <w:i w:val="0"/>
+          <w:color w:val="4338CA"/>
+          <w:sz w:val="25"/>
         </w:rPr>
-        <w:t xml:space="preserve">Step 4 (4-Pillars Run): </w:t>
-      </w:r>
-      <w:r>
-        <w:rPr>
-          <w:rFonts w:ascii="Arial" w:hAnsi="Arial"/>
-          <w:color w:val="334155"/>
-          <w:sz w:val="21"/>
-        </w:rPr>
-        <w:t>Backend file se audio alag karta hai, frames nikaalta hai, aur charo forensic modules run karta hai.</w:t>
+        <w:t>Pillar 4: Melanin-Calibrated rPPG Vascular Pulse (rppg_vascular_pulse.py)</w:t>
       </w:r>
     </w:p>
     <w:p>
       <w:pPr>
-        <w:pStyle w:val="ListBullet"/>
-        <w:spacing w:before="20" w:after="60" w:line="276" w:lineRule="auto"/>
+        <w:spacing w:before="0" w:after="100" w:line="283" w:lineRule="auto"/>
+      </w:pPr>
+      <w:r>
+        <w:rPr>
+          <w:rFonts w:ascii="Arial" w:hAnsi="Arial"/>
+          <w:b w:val="0"/>
+          <w:i w:val="0"/>
+          <w:color w:val="334155"/>
+          <w:sz w:val="21"/>
+        </w:rPr>
+        <w:t>Jab insaan ka dil dhadakta hai, toh skin ke blood vessels mein microscopic color change hota hai. NETRA ka algorithm specially Indian skin tones (Fitzpatrick Type III-VI) ke liye calibrate kiya gaya hai.</w:t>
+      </w:r>
+    </w:p>
+    <w:p>
+      <w:pPr>
+        <w:spacing w:before="0" w:after="100" w:line="283" w:lineRule="auto"/>
+      </w:pPr>
+      <w:r>
+        <w:rPr>
+          <w:rFonts w:ascii="Arial" w:hAnsi="Arial"/>
+          <w:b w:val="0"/>
+          <w:i w:val="0"/>
+          <w:color w:val="334155"/>
+          <w:sz w:val="21"/>
+        </w:rPr>
+        <w:t>Deepfake video mein chehre ke andar khoon nahi behta aur dil nahi dhadakta → pulse signal flat line aati hai → FAKE pakda gaya!</w:t>
+      </w:r>
+    </w:p>
+    <w:p>
+      <w:pPr>
+        <w:spacing w:before="80" w:after="80"/>
+        <w:pBdr>
+          <w:bottom w:val="single" w:sz="4" w:color="CBD5E1"/>
+        </w:pBdr>
+      </w:pPr>
+    </w:p>
+    <w:p>
+      <w:pPr>
+        <w:keepNext/>
+        <w:spacing w:before="360" w:after="120"/>
       </w:pPr>
       <w:r>
         <w:rPr>
           <w:rFonts w:ascii="Arial" w:hAnsi="Arial"/>
           <w:b/>
-          <w:color w:val="0F172A"/>
-          <w:sz w:val="21"/>
+          <w:i w:val="0"/>
+          <w:color w:val="075985"/>
+          <w:sz w:val="30"/>
         </w:rPr>
-        <w:t xml:space="preserve">Step 5 (Verdict &amp; Report): </w:t>
-      </w:r>
-      <w:r>
-        <w:rPr>
-          <w:rFonts w:ascii="Arial" w:hAnsi="Arial"/>
-          <w:color w:val="334155"/>
-          <w:sz w:val="21"/>
-        </w:rPr>
-        <w:t>Screen par turant verdict aata hai (Green = Safe Authentic, Red = Dangerous Deepfake), sath mein shareable report button aur download option!</w:t>
+        <w:t>6. 🚀 Live Demo &amp; How to Run (Direct Commands)</w:t>
       </w:r>
     </w:p>
     <w:p>
       <w:pPr>
-        <w:pStyle w:val="ListBullet"/>
-        <w:spacing w:before="20" w:after="60" w:line="276" w:lineRule="auto"/>
+        <w:spacing w:before="0" w:after="100" w:line="283" w:lineRule="auto"/>
+      </w:pPr>
+      <w:r>
+        <w:rPr>
+          <w:rFonts w:ascii="Arial" w:hAnsi="Arial"/>
+          <w:b w:val="0"/>
+          <w:i w:val="0"/>
+          <w:color w:val="334155"/>
+          <w:sz w:val="21"/>
+        </w:rPr>
+        <w:t>Judges ke samne live real-time benchmark ya frontend chalane ke liye commands:</w:t>
+      </w:r>
+    </w:p>
+    <w:p>
+      <w:pPr>
+        <w:keepNext/>
+        <w:spacing w:before="260" w:after="80"/>
       </w:pPr>
       <w:r>
         <w:rPr>
           <w:rFonts w:ascii="Arial" w:hAnsi="Arial"/>
           <w:b/>
-          <w:color w:val="0F172A"/>
-          <w:sz w:val="21"/>
+          <w:i w:val="0"/>
+          <w:color w:val="4338CA"/>
+          <w:sz w:val="25"/>
         </w:rPr>
-        <w:t xml:space="preserve">Step 6 (Database Save): </w:t>
-      </w:r>
-      <w:r>
-        <w:rPr>
-          <w:rFonts w:ascii="Arial" w:hAnsi="Arial"/>
-          <w:color w:val="334155"/>
-          <w:sz w:val="21"/>
-        </w:rPr>
-        <w:t>Scan ka record chupke se SQLite `netra.db` mein save ho jaata hai taaki user apne dashboard par purani history dekh sake.</w:t>
-      </w:r>
-    </w:p>
-    <w:p>
-      <w:pPr>
-        <w:spacing w:after="120"/>
-      </w:pPr>
-    </w:p>
-    <w:p>
-      <w:pPr>
-        <w:keepNext/>
-        <w:spacing w:before="240" w:after="80"/>
-      </w:pPr>
-      <w:r>
-        <w:rPr>
-          <w:rFonts w:ascii="Arial" w:hAnsi="Arial"/>
-          <w:b/>
-          <w:color w:val="0E7490"/>
-          <w:sz w:val="32"/>
-        </w:rPr>
-        <w:t>6. Baaki Kamaal Ke Features (Radar, Scams &amp; Dev API)</w:t>
-      </w:r>
-      <w:r>
-        <w:rPr>
-          <w:rFonts w:ascii="Arial" w:hAnsi="Arial"/>
-          <w:b/>
-          <w:color w:val="4F46E5"/>
-          <w:sz w:val="26"/>
-        </w:rPr>
-        <w:t>🗺️ 1. Live Threat Radar Map (`/radar`)</w:t>
-      </w:r>
-      <w:r>
-        <w:rPr>
-          <w:rFonts w:ascii="Arial" w:hAnsi="Arial"/>
-          <w:b/>
-          <w:color w:val="4F46E5"/>
-          <w:sz w:val="26"/>
-        </w:rPr>
-        <w:t>📰 2. 24-Hour Tavily AI News Crawler</w:t>
-      </w:r>
-      <w:r>
-        <w:rPr>
-          <w:rFonts w:ascii="Arial" w:hAnsi="Arial"/>
-          <w:b/>
-          <w:color w:val="4F46E5"/>
-          <w:sz w:val="26"/>
-        </w:rPr>
-        <w:t>🚨 3. Community Scam Reporting (`/reported`)</w:t>
-      </w:r>
-      <w:r>
-        <w:rPr>
-          <w:rFonts w:ascii="Arial" w:hAnsi="Arial"/>
-          <w:b/>
-          <w:color w:val="4F46E5"/>
-          <w:sz w:val="26"/>
-        </w:rPr>
-        <w:t>💻 4. Developer API Portal (`/developers`)</w:t>
-      </w:r>
-    </w:p>
-    <w:p>
-      <w:pPr>
-        <w:spacing w:before="0" w:after="80" w:line="276" w:lineRule="auto"/>
-      </w:pPr>
-      <w:r>
-        <w:rPr>
-          <w:rFonts w:ascii="Arial" w:hAnsi="Arial"/>
-          <w:color w:val="334155"/>
-          <w:sz w:val="21"/>
-        </w:rPr>
-        <w:t>Yeh ek interactive Leaflet map hai jisme pure India ke cyber crime hubs (jaise Mewat, Jamtara, Delhi NCR, Bangalore, Hyderabad) par live glowing alert markers dikhte hain. Isse pata chalta hai ki aaj kis sheher mein sabse zyada digital arrest scams chal rahe hain!</w:t>
-      </w:r>
-    </w:p>
-    <w:p>
-      <w:pPr>
-        <w:spacing w:before="0" w:after="80" w:line="276" w:lineRule="auto"/>
-      </w:pPr>
-      <w:r>
-        <w:rPr>
-          <w:rFonts w:ascii="Arial" w:hAnsi="Arial"/>
-          <w:color w:val="334155"/>
-          <w:sz w:val="21"/>
-        </w:rPr>
-        <w:t>Background mein ek worker script 24 ghante internet par search karti rehti hai. Koi bhi nayi deepfake scam news aate hi ye use scrape karke homepage par live news card ki tarah dikha deta hai.</w:t>
-      </w:r>
-    </w:p>
-    <w:p>
-      <w:pPr>
-        <w:spacing w:before="0" w:after="80" w:line="276" w:lineRule="auto"/>
-      </w:pPr>
-      <w:r>
-        <w:rPr>
-          <w:rFonts w:ascii="Arial" w:hAnsi="Arial"/>
-          <w:color w:val="334155"/>
-          <w:sz w:val="21"/>
-        </w:rPr>
-        <w:t>Agar kisi aam citizen ke sath koi scam hota hai ya fake profile milti hai, toh woh bina police station jaaye yaha form bhar kar report kar sakta hai. Ye direct threat database mein chala jaata hai.</w:t>
-      </w:r>
-    </w:p>
-    <w:p>
-      <w:pPr>
-        <w:spacing w:before="0" w:after="80" w:line="276" w:lineRule="auto"/>
-      </w:pPr>
-      <w:r>
-        <w:rPr>
-          <w:rFonts w:ascii="Arial" w:hAnsi="Arial"/>
-          <w:color w:val="334155"/>
-          <w:sz w:val="21"/>
-        </w:rPr>
-        <w:t>Doosri companies (jaise Banks, WhatsApp bots, ya KYC apps) apne system mein NETRA use kar sakti hain! Developers 1-click se apni API key generate kar sakte hain aur Python / Node.js / cURL code copy kar sakte hain.</w:t>
-      </w:r>
-    </w:p>
-    <w:p>
-      <w:pPr>
-        <w:spacing w:after="120"/>
-      </w:pPr>
-    </w:p>
-    <w:p>
-      <w:pPr>
-        <w:keepNext/>
-        <w:spacing w:before="320" w:after="120"/>
-      </w:pPr>
-      <w:r>
-        <w:rPr>
-          <w:rFonts w:ascii="Arial" w:hAnsi="Arial"/>
-          <w:b/>
-          <w:color w:val="0E7490"/>
-          <w:sz w:val="32"/>
-        </w:rPr>
-        <w:t>7. Saboot: NETRA Kitna Accurate Hai? (100-Video Benchmark)</w:t>
-      </w:r>
-    </w:p>
-    <w:p>
-      <w:pPr>
-        <w:spacing w:before="0" w:after="80" w:line="276" w:lineRule="auto"/>
-      </w:pPr>
-      <w:r>
-        <w:rPr>
-          <w:rFonts w:ascii="Arial" w:hAnsi="Arial"/>
-          <w:color w:val="334155"/>
-          <w:sz w:val="21"/>
-        </w:rPr>
-        <w:t>Humne NETRA ko duniya ke doosre famous models (jaise MesoNet, FaceForensics, Xception) ke sath 100 tough deepfake videos par test kiya:</w:t>
+        <w:t>1. Live Real-Time Benchmark Script</w:t>
       </w:r>
     </w:p>
     <w:tbl>
       <w:tblPr>
         <w:tblW w:type="auto" w:w="0"/>
         <w:jc w:val="center"/>
-        <w:tblLayout w:type="fixed"/>
-        <w:tblLook w:firstColumn="1" w:firstRow="1" w:lastColumn="0" w:lastRow="0" w:noHBand="0" w:noVBand="1" w:val="04A0"/>
-      </w:tblPr>
-      <w:tblGrid>
-        <w:gridCol w:w="2484"/>
-        <w:gridCol w:w="2484"/>
-        <w:gridCol w:w="2484"/>
-        <w:gridCol w:w="2484"/>
-      </w:tblGrid>
-      <w:tr>
-        <w:tc>
-          <w:tcPr>
-            <w:tcW w:type="dxa" w:w="2448"/>
-            <w:shd w:fill="1E293B"/>
-            <w:tcMar>
-              <w:top w:w="80" w:type="dxa"/>
-              <w:bottom w:w="80" w:type="dxa"/>
-              <w:left w:w="80" w:type="dxa"/>
-              <w:right w:w="80" w:type="dxa"/>
-            </w:tcMar>
-          </w:tcPr>
-          <w:p>
-            <w:r>
-              <w:rPr>
-                <w:rFonts w:ascii="Arial" w:hAnsi="Arial"/>
-                <w:b/>
-                <w:color w:val="FFFFFF"/>
-                <w:sz w:val="18"/>
-              </w:rPr>
-              <w:t>Model Name</w:t>
-            </w:r>
-          </w:p>
-        </w:tc>
-        <w:tc>
-          <w:tcPr>
-            <w:tcW w:type="dxa" w:w="2448"/>
-            <w:shd w:fill="1E293B"/>
-            <w:tcMar>
-              <w:top w:w="80" w:type="dxa"/>
-              <w:bottom w:w="80" w:type="dxa"/>
-              <w:left w:w="80" w:type="dxa"/>
-              <w:right w:w="80" w:type="dxa"/>
-            </w:tcMar>
-          </w:tcPr>
-          <w:p>
-            <w:r>
-              <w:rPr>
-                <w:rFonts w:ascii="Arial" w:hAnsi="Arial"/>
-                <w:b/>
-                <w:color w:val="FFFFFF"/>
-                <w:sz w:val="18"/>
-              </w:rPr>
-              <w:t>Detection Type</w:t>
-            </w:r>
-          </w:p>
-        </w:tc>
-        <w:tc>
-          <w:tcPr>
-            <w:tcW w:type="dxa" w:w="2448"/>
-            <w:shd w:fill="1E293B"/>
-            <w:tcMar>
-              <w:top w:w="80" w:type="dxa"/>
-              <w:bottom w:w="80" w:type="dxa"/>
-              <w:left w:w="80" w:type="dxa"/>
-              <w:right w:w="80" w:type="dxa"/>
-            </w:tcMar>
-          </w:tcPr>
-          <w:p>
-            <w:r>
-              <w:rPr>
-                <w:rFonts w:ascii="Arial" w:hAnsi="Arial"/>
-                <w:b/>
-                <w:color w:val="FFFFFF"/>
-                <w:sz w:val="18"/>
-              </w:rPr>
-              <w:t>Accuracy on 100 Videos</w:t>
-            </w:r>
-          </w:p>
-        </w:tc>
-        <w:tc>
-          <w:tcPr>
-            <w:tcW w:type="dxa" w:w="2448"/>
-            <w:shd w:fill="1E293B"/>
-            <w:tcMar>
-              <w:top w:w="80" w:type="dxa"/>
-              <w:bottom w:w="80" w:type="dxa"/>
-              <w:left w:w="80" w:type="dxa"/>
-              <w:right w:w="80" w:type="dxa"/>
-            </w:tcMar>
-          </w:tcPr>
-          <w:p>
-            <w:r>
-              <w:rPr>
-                <w:rFonts w:ascii="Arial" w:hAnsi="Arial"/>
-                <w:b/>
-                <w:color w:val="FFFFFF"/>
-                <w:sz w:val="18"/>
-              </w:rPr>
-              <w:t>Latency (Speed)</w:t>
-            </w:r>
-          </w:p>
-        </w:tc>
-      </w:tr>
-      <w:tr>
-        <w:tc>
-          <w:tcPr>
-            <w:tcW w:type="dxa" w:w="2448"/>
-            <w:shd w:fill="F8FAFC"/>
-            <w:tcMar>
-              <w:top w:w="70" w:type="dxa"/>
-              <w:bottom w:w="70" w:type="dxa"/>
-              <w:left w:w="70" w:type="dxa"/>
-              <w:right w:w="70" w:type="dxa"/>
-            </w:tcMar>
-          </w:tcPr>
-          <w:p>
-            <w:r>
-              <w:rPr>
-                <w:rFonts w:ascii="Arial" w:hAnsi="Arial"/>
-                <w:color w:val="1E293B"/>
-                <w:sz w:val="17"/>
-              </w:rPr>
-              <w:t>MesoNet-4</w:t>
-            </w:r>
-          </w:p>
-        </w:tc>
-        <w:tc>
-          <w:tcPr>
-            <w:tcW w:type="dxa" w:w="2448"/>
-            <w:shd w:fill="F8FAFC"/>
-            <w:tcMar>
-              <w:top w:w="70" w:type="dxa"/>
-              <w:bottom w:w="70" w:type="dxa"/>
-              <w:left w:w="70" w:type="dxa"/>
-              <w:right w:w="70" w:type="dxa"/>
-            </w:tcMar>
-          </w:tcPr>
-          <w:p>
-            <w:r>
-              <w:rPr>
-                <w:rFonts w:ascii="Arial" w:hAnsi="Arial"/>
-                <w:color w:val="1E293B"/>
-                <w:sz w:val="17"/>
-              </w:rPr>
-              <w:t>Spatial Only</w:t>
-            </w:r>
-          </w:p>
-        </w:tc>
-        <w:tc>
-          <w:tcPr>
-            <w:tcW w:type="dxa" w:w="2448"/>
-            <w:shd w:fill="F8FAFC"/>
-            <w:tcMar>
-              <w:top w:w="70" w:type="dxa"/>
-              <w:bottom w:w="70" w:type="dxa"/>
-              <w:left w:w="70" w:type="dxa"/>
-              <w:right w:w="70" w:type="dxa"/>
-            </w:tcMar>
-          </w:tcPr>
-          <w:p>
-            <w:r>
-              <w:rPr>
-                <w:rFonts w:ascii="Arial" w:hAnsi="Arial"/>
-                <w:color w:val="1E293B"/>
-                <w:sz w:val="17"/>
-              </w:rPr>
-              <w:t>68.4%</w:t>
-            </w:r>
-          </w:p>
-        </w:tc>
-        <w:tc>
-          <w:tcPr>
-            <w:tcW w:type="dxa" w:w="2448"/>
-            <w:shd w:fill="F8FAFC"/>
-            <w:tcMar>
-              <w:top w:w="70" w:type="dxa"/>
-              <w:bottom w:w="70" w:type="dxa"/>
-              <w:left w:w="70" w:type="dxa"/>
-              <w:right w:w="70" w:type="dxa"/>
-            </w:tcMar>
-          </w:tcPr>
-          <w:p>
-            <w:r>
-              <w:rPr>
-                <w:rFonts w:ascii="Arial" w:hAnsi="Arial"/>
-                <w:color w:val="1E293B"/>
-                <w:sz w:val="17"/>
-              </w:rPr>
-              <w:t>12 ms</w:t>
-            </w:r>
-          </w:p>
-        </w:tc>
-      </w:tr>
-      <w:tr>
-        <w:tc>
-          <w:tcPr>
-            <w:tcW w:type="dxa" w:w="2448"/>
-            <w:shd w:fill="FFFFFF"/>
-            <w:tcMar>
-              <w:top w:w="70" w:type="dxa"/>
-              <w:bottom w:w="70" w:type="dxa"/>
-              <w:left w:w="70" w:type="dxa"/>
-              <w:right w:w="70" w:type="dxa"/>
-            </w:tcMar>
-          </w:tcPr>
-          <w:p>
-            <w:r>
-              <w:rPr>
-                <w:rFonts w:ascii="Arial" w:hAnsi="Arial"/>
-                <w:color w:val="1E293B"/>
-                <w:sz w:val="17"/>
-              </w:rPr>
-              <w:t>FaceForensics++ (Xception)</w:t>
-            </w:r>
-          </w:p>
-        </w:tc>
-        <w:tc>
-          <w:tcPr>
-            <w:tcW w:type="dxa" w:w="2448"/>
-            <w:shd w:fill="FFFFFF"/>
-            <w:tcMar>
-              <w:top w:w="70" w:type="dxa"/>
-              <w:bottom w:w="70" w:type="dxa"/>
-              <w:left w:w="70" w:type="dxa"/>
-              <w:right w:w="70" w:type="dxa"/>
-            </w:tcMar>
-          </w:tcPr>
-          <w:p>
-            <w:r>
-              <w:rPr>
-                <w:rFonts w:ascii="Arial" w:hAnsi="Arial"/>
-                <w:color w:val="1E293B"/>
-                <w:sz w:val="17"/>
-              </w:rPr>
-              <w:t>Spatial Only</w:t>
-            </w:r>
-          </w:p>
-        </w:tc>
-        <w:tc>
-          <w:tcPr>
-            <w:tcW w:type="dxa" w:w="2448"/>
-            <w:shd w:fill="FFFFFF"/>
-            <w:tcMar>
-              <w:top w:w="70" w:type="dxa"/>
-              <w:bottom w:w="70" w:type="dxa"/>
-              <w:left w:w="70" w:type="dxa"/>
-              <w:right w:w="70" w:type="dxa"/>
-            </w:tcMar>
-          </w:tcPr>
-          <w:p>
-            <w:r>
-              <w:rPr>
-                <w:rFonts w:ascii="Arial" w:hAnsi="Arial"/>
-                <w:color w:val="1E293B"/>
-                <w:sz w:val="17"/>
-              </w:rPr>
-              <w:t>84.2%</w:t>
-            </w:r>
-          </w:p>
-        </w:tc>
-        <w:tc>
-          <w:tcPr>
-            <w:tcW w:type="dxa" w:w="2448"/>
-            <w:shd w:fill="FFFFFF"/>
-            <w:tcMar>
-              <w:top w:w="70" w:type="dxa"/>
-              <w:bottom w:w="70" w:type="dxa"/>
-              <w:left w:w="70" w:type="dxa"/>
-              <w:right w:w="70" w:type="dxa"/>
-            </w:tcMar>
-          </w:tcPr>
-          <w:p>
-            <w:r>
-              <w:rPr>
-                <w:rFonts w:ascii="Arial" w:hAnsi="Arial"/>
-                <w:color w:val="1E293B"/>
-                <w:sz w:val="17"/>
-              </w:rPr>
-              <w:t>48 ms</w:t>
-            </w:r>
-          </w:p>
-        </w:tc>
-      </w:tr>
-      <w:tr>
-        <w:tc>
-          <w:tcPr>
-            <w:tcW w:type="dxa" w:w="2448"/>
-            <w:shd w:fill="F8FAFC"/>
-            <w:tcMar>
-              <w:top w:w="70" w:type="dxa"/>
-              <w:bottom w:w="70" w:type="dxa"/>
-              <w:left w:w="70" w:type="dxa"/>
-              <w:right w:w="70" w:type="dxa"/>
-            </w:tcMar>
-          </w:tcPr>
-          <w:p>
-            <w:r>
-              <w:rPr>
-                <w:rFonts w:ascii="Arial" w:hAnsi="Arial"/>
-                <w:color w:val="1E293B"/>
-                <w:sz w:val="17"/>
-              </w:rPr>
-              <w:t>Audio-Only Sync Detector</w:t>
-            </w:r>
-          </w:p>
-        </w:tc>
-        <w:tc>
-          <w:tcPr>
-            <w:tcW w:type="dxa" w:w="2448"/>
-            <w:shd w:fill="F8FAFC"/>
-            <w:tcMar>
-              <w:top w:w="70" w:type="dxa"/>
-              <w:bottom w:w="70" w:type="dxa"/>
-              <w:left w:w="70" w:type="dxa"/>
-              <w:right w:w="70" w:type="dxa"/>
-            </w:tcMar>
-          </w:tcPr>
-          <w:p>
-            <w:r>
-              <w:rPr>
-                <w:rFonts w:ascii="Arial" w:hAnsi="Arial"/>
-                <w:color w:val="1E293B"/>
-                <w:sz w:val="17"/>
-              </w:rPr>
-              <w:t>Acoustic Only</w:t>
-            </w:r>
-          </w:p>
-        </w:tc>
-        <w:tc>
-          <w:tcPr>
-            <w:tcW w:type="dxa" w:w="2448"/>
-            <w:shd w:fill="F8FAFC"/>
-            <w:tcMar>
-              <w:top w:w="70" w:type="dxa"/>
-              <w:bottom w:w="70" w:type="dxa"/>
-              <w:left w:w="70" w:type="dxa"/>
-              <w:right w:w="70" w:type="dxa"/>
-            </w:tcMar>
-          </w:tcPr>
-          <w:p>
-            <w:r>
-              <w:rPr>
-                <w:rFonts w:ascii="Arial" w:hAnsi="Arial"/>
-                <w:color w:val="1E293B"/>
-                <w:sz w:val="17"/>
-              </w:rPr>
-              <w:t>72.0%</w:t>
-            </w:r>
-          </w:p>
-        </w:tc>
-        <w:tc>
-          <w:tcPr>
-            <w:tcW w:type="dxa" w:w="2448"/>
-            <w:shd w:fill="F8FAFC"/>
-            <w:tcMar>
-              <w:top w:w="70" w:type="dxa"/>
-              <w:bottom w:w="70" w:type="dxa"/>
-              <w:left w:w="70" w:type="dxa"/>
-              <w:right w:w="70" w:type="dxa"/>
-            </w:tcMar>
-          </w:tcPr>
-          <w:p>
-            <w:r>
-              <w:rPr>
-                <w:rFonts w:ascii="Arial" w:hAnsi="Arial"/>
-                <w:color w:val="1E293B"/>
-                <w:sz w:val="17"/>
-              </w:rPr>
-              <w:t>30 ms</w:t>
-            </w:r>
-          </w:p>
-        </w:tc>
-      </w:tr>
-      <w:tr>
-        <w:tc>
-          <w:tcPr>
-            <w:tcW w:type="dxa" w:w="2448"/>
-            <w:shd w:fill="ECFDF5"/>
-            <w:tcMar>
-              <w:top w:w="70" w:type="dxa"/>
-              <w:bottom w:w="70" w:type="dxa"/>
-              <w:left w:w="70" w:type="dxa"/>
-              <w:right w:w="70" w:type="dxa"/>
-            </w:tcMar>
-          </w:tcPr>
-          <w:p>
-            <w:r>
-              <w:rPr>
-                <w:rFonts w:ascii="Arial" w:hAnsi="Arial"/>
-                <w:b/>
-                <w:color w:val="065F46"/>
-                <w:sz w:val="17"/>
-              </w:rPr>
-              <w:t>NETRA v5.1 (4-Pillars Arbiter)</w:t>
-            </w:r>
-          </w:p>
-        </w:tc>
-        <w:tc>
-          <w:tcPr>
-            <w:tcW w:type="dxa" w:w="2448"/>
-            <w:shd w:fill="ECFDF5"/>
-            <w:tcMar>
-              <w:top w:w="70" w:type="dxa"/>
-              <w:bottom w:w="70" w:type="dxa"/>
-              <w:left w:w="70" w:type="dxa"/>
-              <w:right w:w="70" w:type="dxa"/>
-            </w:tcMar>
-          </w:tcPr>
-          <w:p>
-            <w:r>
-              <w:rPr>
-                <w:rFonts w:ascii="Arial" w:hAnsi="Arial"/>
-                <w:b/>
-                <w:color w:val="065F46"/>
-                <w:sz w:val="17"/>
-              </w:rPr>
-              <w:t>Spatial + AudioVisual + Ocular + Vascular</w:t>
-            </w:r>
-          </w:p>
-        </w:tc>
-        <w:tc>
-          <w:tcPr>
-            <w:tcW w:type="dxa" w:w="2448"/>
-            <w:shd w:fill="ECFDF5"/>
-            <w:tcMar>
-              <w:top w:w="70" w:type="dxa"/>
-              <w:bottom w:w="70" w:type="dxa"/>
-              <w:left w:w="70" w:type="dxa"/>
-              <w:right w:w="70" w:type="dxa"/>
-            </w:tcMar>
-          </w:tcPr>
-          <w:p>
-            <w:r>
-              <w:rPr>
-                <w:rFonts w:ascii="Arial" w:hAnsi="Arial"/>
-                <w:b/>
-                <w:color w:val="065F46"/>
-                <w:sz w:val="17"/>
-              </w:rPr>
-              <w:t>98.7%</w:t>
-            </w:r>
-          </w:p>
-        </w:tc>
-        <w:tc>
-          <w:tcPr>
-            <w:tcW w:type="dxa" w:w="2448"/>
-            <w:shd w:fill="ECFDF5"/>
-            <w:tcMar>
-              <w:top w:w="70" w:type="dxa"/>
-              <w:bottom w:w="70" w:type="dxa"/>
-              <w:left w:w="70" w:type="dxa"/>
-              <w:right w:w="70" w:type="dxa"/>
-            </w:tcMar>
-          </w:tcPr>
-          <w:p>
-            <w:r>
-              <w:rPr>
-                <w:rFonts w:ascii="Arial" w:hAnsi="Arial"/>
-                <w:b/>
-                <w:color w:val="065F46"/>
-                <w:sz w:val="17"/>
-              </w:rPr>
-              <w:t>34 ms</w:t>
-            </w:r>
-          </w:p>
-        </w:tc>
-      </w:tr>
-    </w:tbl>
-    <w:p>
-      <w:pPr>
-        <w:spacing w:after="160"/>
-      </w:pPr>
-    </w:p>
-    <w:p>
-      <w:pPr>
-        <w:keepNext/>
-        <w:spacing w:before="320" w:after="120"/>
-      </w:pPr>
-      <w:r>
-        <w:rPr>
-          <w:rFonts w:ascii="Arial" w:hAnsi="Arial"/>
-          <w:b/>
-          <w:color w:val="0E7490"/>
-          <w:sz w:val="32"/>
-        </w:rPr>
-        <w:t>8. Project Ko Run Kaise Karein? (Simple Commands)</w:t>
-      </w:r>
-    </w:p>
-    <w:p>
-      <w:pPr>
-        <w:spacing w:before="0" w:after="80" w:line="276" w:lineRule="auto"/>
-      </w:pPr>
-      <w:r>
-        <w:rPr>
-          <w:rFonts w:ascii="Arial" w:hAnsi="Arial"/>
-          <w:color w:val="334155"/>
-          <w:sz w:val="21"/>
-        </w:rPr>
-        <w:t>Agar koi bhi is project ko apne laptop par chalana chahta hai, toh bas ye 2-3 simple steps follow karne hain:</w:t>
-      </w:r>
-    </w:p>
-    <w:p>
-      <w:pPr>
-        <w:pStyle w:val="ListBullet"/>
-        <w:spacing w:before="20" w:after="60" w:line="276" w:lineRule="auto"/>
-      </w:pPr>
-      <w:r>
-        <w:rPr>
-          <w:rFonts w:ascii="Arial" w:hAnsi="Arial"/>
-          <w:b/>
-          <w:color w:val="0F172A"/>
-          <w:sz w:val="21"/>
-        </w:rPr>
-        <w:t xml:space="preserve">1. Backend Server Start Karna : </w:t>
-      </w:r>
-      <w:r>
-        <w:rPr>
-          <w:rFonts w:ascii="Arial" w:hAnsi="Arial"/>
-          <w:color w:val="334155"/>
-          <w:sz w:val="21"/>
-        </w:rPr>
-        <w:t>Terminal kholo aur run karo:</w:t>
-        <w:br/>
-        <w:t xml:space="preserve">   cd netra/backend</w:t>
-        <w:br/>
-        <w:t xml:space="preserve">   uvicorn api.server:app --reload --port 8000</w:t>
-      </w:r>
-    </w:p>
-    <w:p>
-      <w:pPr>
-        <w:pStyle w:val="ListBullet"/>
-        <w:spacing w:before="20" w:after="60" w:line="276" w:lineRule="auto"/>
-      </w:pPr>
-      <w:r>
-        <w:rPr>
-          <w:rFonts w:ascii="Arial" w:hAnsi="Arial"/>
-          <w:b/>
-          <w:color w:val="0F172A"/>
-          <w:sz w:val="21"/>
-        </w:rPr>
-        <w:t xml:space="preserve">2. Frontend Website Start Karna : </w:t>
-      </w:r>
-      <w:r>
-        <w:rPr>
-          <w:rFonts w:ascii="Arial" w:hAnsi="Arial"/>
-          <w:color w:val="334155"/>
-          <w:sz w:val="21"/>
-        </w:rPr>
-        <w:t>Ek naye terminal mein run karo:</w:t>
-        <w:br/>
-        <w:t xml:space="preserve">   cd netra/frontend</w:t>
-        <w:br/>
-        <w:t xml:space="preserve">   npm run dev</w:t>
-        <w:br/>
-        <w:t xml:space="preserve">   Browser mein kholo: http://localhost:3000</w:t>
-      </w:r>
-    </w:p>
-    <w:p>
-      <w:pPr>
-        <w:pStyle w:val="ListBullet"/>
-        <w:spacing w:before="20" w:after="60" w:line="276" w:lineRule="auto"/>
-      </w:pPr>
-      <w:r>
-        <w:rPr>
-          <w:rFonts w:ascii="Arial" w:hAnsi="Arial"/>
-          <w:b/>
-          <w:color w:val="0F172A"/>
-          <w:sz w:val="21"/>
-        </w:rPr>
-        <w:t xml:space="preserve">3. 4-Pillars Test Suite Run Karna : </w:t>
-      </w:r>
-      <w:r>
-        <w:rPr>
-          <w:rFonts w:ascii="Arial" w:hAnsi="Arial"/>
-          <w:color w:val="334155"/>
-          <w:sz w:val="21"/>
-        </w:rPr>
-        <w:t>AI detection test karne ke liye run karo:</w:t>
-        <w:br/>
-        <w:t xml:space="preserve">   python3 tests/test_four_pillars_system.py</w:t>
-      </w:r>
-    </w:p>
-    <w:tbl>
-      <w:tblPr>
-        <w:tblW w:type="auto" w:w="0"/>
-        <w:jc w:val="center"/>
-        <w:tblLayout w:type="fixed"/>
         <w:tblLook w:firstColumn="1" w:firstRow="1" w:lastColumn="0" w:lastRow="0" w:noHBand="0" w:noVBand="1" w:val="04A0"/>
       </w:tblPr>
       <w:tblGrid>
@@ -2728,59 +2647,202 @@
       <w:tr>
         <w:tc>
           <w:tcPr>
-            <w:tcW w:type="dxa" w:w="9360"/>
-            <w:shd w:fill="F0FDF4"/>
+            <w:tcW w:type="dxa" w:w="9792"/>
+            <w:shd w:fill="0F172A" w:val="clear"/>
             <w:tcMar>
-              <w:top w:w="160" w:type="dxa"/>
-              <w:bottom w:w="160" w:type="dxa"/>
-              <w:left w:w="240" w:type="dxa"/>
-              <w:right w:w="200" w:type="dxa"/>
+              <w:top w:w="100" w:type="dxa"/>
+              <w:bottom w:w="100" w:type="dxa"/>
+              <w:left w:w="140" w:type="dxa"/>
+              <w:right w:w="140" w:type="dxa"/>
+            </w:tcMar>
+          </w:tcPr>
+          <w:p>
+            <w:r>
+              <w:rPr>
+                <w:rFonts w:ascii="Courier New" w:hAnsi="Courier New"/>
+                <w:b w:val="0"/>
+                <w:i w:val="0"/>
+                <w:color w:val="86EFAC"/>
+                <w:sz w:val="17"/>
+              </w:rPr>
+              <w:t># 100 deepfake videos par live detection table chalane ke liye:</w:t>
+              <w:br/>
+              <w:t>/Users/iamsparsh00321/Desktop/newantigravworkfolder/benchmark.sh</w:t>
+              <w:br/>
+              <w:br/>
+              <w:t># Or directly:</w:t>
+              <w:br/>
+              <w:t>python3 /Users/iamsparsh00321/Desktop/newantigravworkfolder/benchmark.py</w:t>
+            </w:r>
+          </w:p>
+        </w:tc>
+      </w:tr>
+    </w:tbl>
+    <w:p>
+      <w:pPr>
+        <w:spacing w:after="80"/>
+      </w:pPr>
+    </w:p>
+    <w:p>
+      <w:pPr>
+        <w:keepNext/>
+        <w:spacing w:before="260" w:after="80"/>
+      </w:pPr>
+      <w:r>
+        <w:rPr>
+          <w:rFonts w:ascii="Arial" w:hAnsi="Arial"/>
+          <w:b/>
+          <w:i w:val="0"/>
+          <w:color w:val="4338CA"/>
+          <w:sz w:val="25"/>
+        </w:rPr>
+        <w:t>2. Full Stack Run</w:t>
+      </w:r>
+    </w:p>
+    <w:tbl>
+      <w:tblPr>
+        <w:tblW w:type="auto" w:w="0"/>
+        <w:jc w:val="center"/>
+        <w:tblLook w:firstColumn="1" w:firstRow="1" w:lastColumn="0" w:lastRow="0" w:noHBand="0" w:noVBand="1" w:val="04A0"/>
+      </w:tblPr>
+      <w:tblGrid>
+        <w:gridCol w:w="9936"/>
+      </w:tblGrid>
+      <w:tr>
+        <w:tc>
+          <w:tcPr>
+            <w:tcW w:type="dxa" w:w="9792"/>
+            <w:shd w:fill="0F172A" w:val="clear"/>
+            <w:tcMar>
+              <w:top w:w="100" w:type="dxa"/>
+              <w:bottom w:w="100" w:type="dxa"/>
+              <w:left w:w="140" w:type="dxa"/>
+              <w:right w:w="140" w:type="dxa"/>
+            </w:tcMar>
+          </w:tcPr>
+          <w:p>
+            <w:r>
+              <w:rPr>
+                <w:rFonts w:ascii="Courier New" w:hAnsi="Courier New"/>
+                <w:b w:val="0"/>
+                <w:i w:val="0"/>
+                <w:color w:val="86EFAC"/>
+                <w:sz w:val="17"/>
+              </w:rPr>
+              <w:t># Backend API server:</w:t>
+              <w:br/>
+              <w:t>cd netra/backend</w:t>
+              <w:br/>
+              <w:t>uvicorn api.server:app --reload --port 8000</w:t>
+              <w:br/>
+              <w:br/>
+              <w:t># Frontend UI (Next.js 14):</w:t>
+              <w:br/>
+              <w:t>cd netra/frontend</w:t>
+              <w:br/>
+              <w:t>npm run dev</w:t>
+              <w:br/>
+              <w:t># Open: http://localhost:3000</w:t>
+              <w:br/>
+              <w:br/>
+              <w:t># 4-Pillars Automated Test Suite:</w:t>
+              <w:br/>
+              <w:t>python3 tests/test_four_pillars_system.py</w:t>
+            </w:r>
+          </w:p>
+        </w:tc>
+      </w:tr>
+    </w:tbl>
+    <w:p>
+      <w:pPr>
+        <w:spacing w:after="80"/>
+      </w:pPr>
+    </w:p>
+    <w:tbl>
+      <w:tblPr>
+        <w:tblW w:type="auto" w:w="0"/>
+        <w:jc w:val="center"/>
+        <w:tblLook w:firstColumn="1" w:firstRow="1" w:lastColumn="0" w:lastRow="0" w:noHBand="0" w:noVBand="1" w:val="04A0"/>
+      </w:tblPr>
+      <w:tblGrid>
+        <w:gridCol w:w="9936"/>
+      </w:tblGrid>
+      <w:tr>
+        <w:tc>
+          <w:tcPr>
+            <w:tcW w:type="dxa" w:w="9792"/>
+            <w:shd w:fill="F0FDF4" w:val="clear"/>
+            <w:tcMar>
+              <w:top w:w="140" w:type="dxa"/>
+              <w:bottom w:w="140" w:type="dxa"/>
+              <w:left w:w="180" w:type="dxa"/>
+              <w:right w:w="180" w:type="dxa"/>
             </w:tcMar>
             <w:tcBorders>
               <w:top w:val="none"/>
-              <w:left w:val="single" w:sz="24" w:space="0" w:color="22C55E"/>
+              <w:right w:val="none"/>
               <w:bottom w:val="none"/>
-              <w:right w:val="none"/>
+              <w:left w:val="single" w:sz="32" w:color="22C55E"/>
             </w:tcBorders>
           </w:tcPr>
           <w:p>
             <w:pPr>
-              <w:spacing w:before="40" w:after="80"/>
+              <w:spacing w:after="80"/>
             </w:pPr>
             <w:r>
               <w:rPr>
                 <w:rFonts w:ascii="Arial" w:hAnsi="Arial"/>
                 <w:b/>
-                <w:color w:val="104628"/>
+                <w:i w:val="0"/>
+                <w:color w:val="14532D"/>
                 <w:sz w:val="22"/>
               </w:rPr>
-              <w:t>🚀 Ready to Deploy</w:t>
+              <w:t>🇮🇳 Project NETRA Summary in 3 Lines:</w:t>
             </w:r>
           </w:p>
           <w:p>
             <w:pPr>
-              <w:spacing w:before="40" w:after="40"/>
+              <w:spacing w:before="20" w:after="40"/>
             </w:pPr>
             <w:r>
               <w:rPr>
                 <w:rFonts w:ascii="Arial" w:hAnsi="Arial"/>
+                <w:b w:val="0"/>
+                <w:i w:val="0"/>
                 <w:color w:val="1E293B"/>
-                <w:sz w:val="20"/>
+                <w:sz w:val="21"/>
               </w:rPr>
-              <w:t>Sab kuch 100% automated aur zero-cost architecture par set hai!</w:t>
+              <w:t>1. No LLM Text Hallucinations — Pure deterministic Computer Vision &amp; Biological Physics.</w:t>
             </w:r>
           </w:p>
           <w:p>
             <w:pPr>
-              <w:spacing w:before="40" w:after="40"/>
+              <w:spacing w:before="20" w:after="40"/>
             </w:pPr>
             <w:r>
               <w:rPr>
                 <w:rFonts w:ascii="Arial" w:hAnsi="Arial"/>
+                <w:b w:val="0"/>
+                <w:i w:val="0"/>
                 <w:color w:val="1E293B"/>
-                <w:sz w:val="20"/>
+                <w:sz w:val="21"/>
               </w:rPr>
-              <w:t>Frontend aur Backend dono super lightweight hain aur kisi bhi standard Mac ya Linux system par smoothly chalte hain.</w:t>
+              <w:t>2. GenD ViT-L/14 Foundation + LinearNorm Head eliminates DSLR false alarms.</w:t>
+            </w:r>
+          </w:p>
+          <w:p>
+            <w:pPr>
+              <w:spacing w:before="20" w:after="40"/>
+            </w:pPr>
+            <w:r>
+              <w:rPr>
+                <w:rFonts w:ascii="Arial" w:hAnsi="Arial"/>
+                <w:b w:val="0"/>
+                <w:i w:val="0"/>
+                <w:color w:val="1E293B"/>
+                <w:sz w:val="21"/>
+              </w:rPr>
+              <w:t>3. 100% Sovereign &amp; Indian Face Optimized — tested across 100 high-profile Indian deepfakes!</w:t>
             </w:r>
           </w:p>
         </w:tc>
@@ -2793,7 +2855,7 @@
     </w:p>
     <w:sectPr>
       <w:pgSz w:w="12240" w:h="15840"/>
-      <w:pgMar w:top="1080" w:right="1152" w:bottom="1080" w:left="1152" w:header="720" w:footer="720" w:gutter="0"/>
+      <w:pgMar w:top="1008" w:right="1152" w:bottom="1008" w:left="1152" w:header="720" w:footer="720" w:gutter="0"/>
       <w:cols w:space="720"/>
       <w:docGrid w:linePitch="360"/>
     </w:sectPr>

</xml_diff>

<commit_message>
refactor: replace rahulgandhiowner → sparsh across all scripts, tests, docs, benchmark reports, and master documentation
</commit_message>
<xml_diff>
--- a/NETRA_Project_Documentation_Hinglish_Easy.docx
+++ b/NETRA_Project_Documentation_Hinglish_Easy.docx
@@ -1283,7 +1283,7 @@
                 <w:sz w:val="18"/>
                 <w:rFonts w:ascii="Calibri" w:hAnsi="Calibri"/>
               </w:rPr>
-              <w:t xml:space="preserve">Rahul Gandhi driving video (rahulgandhiowner.mov, 148 frames @ 1080p) par Narendra Modi ki identity morph karne ka initial testbed banaya. MesoNet-4 aur MesoInception-4 ko benchmark kiya.</w:t>
+              <w:t xml:space="preserve">Rahul Gandhi driving video (sparsh.mov, 148 frames @ 1080p) par Narendra Modi ki identity morph karne ka initial testbed banaya. MesoNet-4 aur MesoInception-4 ko benchmark kiya.</w:t>
             </w:r>
           </w:p>
         </w:tc>
@@ -8054,7 +8054,7 @@
                 <w:sz w:val="18"/>
                 <w:rFonts w:ascii="Calibri" w:hAnsi="Calibri"/>
               </w:rPr>
-              <w:t xml:space="preserve">UNSEEN EVALUATION: 100 prominent Indian public figures transferred onto target driving video (rahulgandhiowner.mov).</w:t>
+              <w:t xml:space="preserve">UNSEEN EVALUATION: 100 prominent Indian public figures transferred onto target driving video (sparsh.mov).</w:t>
             </w:r>
           </w:p>
         </w:tc>

</xml_diff>